<commit_message>
correccion lagged y otros
</commit_message>
<xml_diff>
--- a/Auxiliar/Data_and_Variable_Construction.docx
+++ b/Auxiliar/Data_and_Variable_Construction.docx
@@ -141,17 +141,27 @@
       </w:pPr>
       <w:r>
         <w:rPr>
-          <w:b/>
-          <w:bCs/>
-          <w:lang w:val="en-US"/>
-        </w:rPr>
-        <w:t>Role in the paper:</w:t>
-      </w:r>
-      <w:r>
-        <w:rPr>
-          <w:lang w:val="en-US"/>
-        </w:rPr>
-        <w:t xml:space="preserve"> the 1970 census identifies Spanish immigrants who arrived between 1936-1955; the 1980 census identifies those who arrived between 1956-1978; the 2010 census provides pre-treatment municipal covariates (population density, education, age structure, employment, gender composition).</w:t>
+          <w:lang w:val="en-US"/>
+        </w:rPr>
+        <w:t>T</w:t>
+      </w:r>
+      <w:r>
+        <w:rPr>
+          <w:lang w:val="en-US"/>
+        </w:rPr>
+        <w:t>he 1970 census identifies Spanish immigrants who arrived between 1936-1955; the 1980 census identifies those who arrived between 1956-1978; the 2010 census provides pre-treatment municipal covariates (population density, education, age structure, employment, gender composition)</w:t>
+      </w:r>
+      <w:r>
+        <w:rPr>
+          <w:lang w:val="en-US"/>
+        </w:rPr>
+        <w:t xml:space="preserve"> for entropy balancing</w:t>
+      </w:r>
+      <w:r>
+        <w:rPr>
+          <w:lang w:val="en-US"/>
+        </w:rPr>
+        <w:t>.</w:t>
       </w:r>
     </w:p>
     <w:p>
@@ -192,7 +202,13 @@
         <w:rPr>
           <w:lang w:val="en-US"/>
         </w:rPr>
-        <w:t>The original data are provided at the electoral-section level and are aggregated to the municipality level for the analysis. Electoral sections are generally smaller than municipalities, although in some cases the two geographic units coincide.</w:t>
+        <w:t>The original data are provided at the electoral-section level and are aggregated to the municipality level for the analysis. Electoral sections are smaller than municipalities</w:t>
+      </w:r>
+      <w:r>
+        <w:rPr>
+          <w:lang w:val="en-US"/>
+        </w:rPr>
+        <w:t>.</w:t>
       </w:r>
     </w:p>
     <w:p>
@@ -209,19 +225,13 @@
           <w:bCs/>
           <w:lang w:val="en-US"/>
         </w:rPr>
-        <w:t>Sources:</w:t>
-      </w:r>
-      <w:r>
-        <w:rPr>
-          <w:lang w:val="en-US"/>
-        </w:rPr>
-        <w:t xml:space="preserve"> </w:t>
-      </w:r>
-      <w:r>
-        <w:rPr>
-          <w:lang w:val="en-US"/>
-        </w:rPr>
-        <w:t xml:space="preserve">Source: The data were downloaded from </w:t>
+        <w:t>Source:</w:t>
+      </w:r>
+      <w:r>
+        <w:rPr>
+          <w:lang w:val="en-US"/>
+        </w:rPr>
+        <w:t xml:space="preserve"> The data were downloaded from </w:t>
       </w:r>
       <w:hyperlink r:id="rId8" w:history="1">
         <w:r>
@@ -345,22 +355,22 @@
           <w:color w:val="1F4E79"/>
           <w:lang w:val="en-US"/>
         </w:rPr>
+        <w:t>2. Treatment Variables</w:t>
+      </w:r>
+    </w:p>
+    <w:p>
+      <w:pPr>
+        <w:spacing w:before="60" w:after="60" w:line="276" w:lineRule="auto"/>
+        <w:jc w:val="both"/>
+        <w:rPr>
+          <w:lang w:val="en-US"/>
+        </w:rPr>
+      </w:pPr>
+      <w:r>
+        <w:rPr>
+          <w:lang w:val="en-US"/>
+        </w:rPr>
         <w:lastRenderedPageBreak/>
-        <w:t>2. Treatment Variables</w:t>
-      </w:r>
-    </w:p>
-    <w:p>
-      <w:pPr>
-        <w:spacing w:before="60" w:after="60" w:line="276" w:lineRule="auto"/>
-        <w:jc w:val="both"/>
-        <w:rPr>
-          <w:lang w:val="en-US"/>
-        </w:rPr>
-      </w:pPr>
-      <w:r>
-        <w:rPr>
-          <w:lang w:val="en-US"/>
-        </w:rPr>
         <w:t xml:space="preserve">The two treatment variables measure historical Spanish exposure by arrival window at the municipal level, expressed as a percentage of the municipal population at the corresponding census. </w:t>
       </w:r>
     </w:p>
@@ -379,7 +389,61 @@
           <w:color w:val="2E75B6"/>
           <w:lang w:val="en-US"/>
         </w:rPr>
-        <w:t>2.1 share_1936_1955</w:t>
+        <w:t xml:space="preserve">2.1 </w:t>
+      </w:r>
+      <w:r>
+        <w:rPr>
+          <w:b/>
+          <w:bCs/>
+          <w:color w:val="2E75B6"/>
+          <w:lang w:val="en-US"/>
+        </w:rPr>
+        <w:t xml:space="preserve">Spanish </w:t>
+      </w:r>
+      <w:r>
+        <w:rPr>
+          <w:b/>
+          <w:bCs/>
+          <w:color w:val="2E75B6"/>
+          <w:lang w:val="en-US"/>
+        </w:rPr>
+        <w:t>share</w:t>
+      </w:r>
+      <w:r>
+        <w:rPr>
+          <w:b/>
+          <w:bCs/>
+          <w:color w:val="2E75B6"/>
+          <w:lang w:val="en-US"/>
+        </w:rPr>
+        <w:t xml:space="preserve"> </w:t>
+      </w:r>
+      <w:r>
+        <w:rPr>
+          <w:b/>
+          <w:bCs/>
+          <w:color w:val="2E75B6"/>
+          <w:lang w:val="en-US"/>
+        </w:rPr>
+        <w:t>1936</w:t>
+      </w:r>
+      <w:r>
+        <w:rPr>
+          <w:b/>
+          <w:bCs/>
+          <w:color w:val="2E75B6"/>
+          <w:lang w:val="en-US"/>
+        </w:rPr>
+        <w:t>-</w:t>
+      </w:r>
+      <w:r>
+        <w:rPr>
+          <w:b/>
+          <w:bCs/>
+          <w:color w:val="2E75B6"/>
+          <w:lang w:val="en-US"/>
+        </w:rPr>
+        <w:t>1955</w:t>
       </w:r>
     </w:p>
     <w:p>
@@ -425,7 +489,7 @@
           <w:iCs/>
           <w:lang w:val="en-US"/>
         </w:rPr>
-        <w:t>share_1936_1955 = 100 x (spanish-born arrived 1936-1955, weighted count) / (total 1970 municipal population</w:t>
+        <w:t xml:space="preserve">Spanish </w:t>
       </w:r>
       <w:r>
         <w:rPr>
@@ -433,7 +497,7 @@
           <w:iCs/>
           <w:lang w:val="en-US"/>
         </w:rPr>
-        <w:t xml:space="preserve">, </w:t>
+        <w:t>share</w:t>
       </w:r>
       <w:r>
         <w:rPr>
@@ -441,7 +505,7 @@
           <w:iCs/>
           <w:lang w:val="en-US"/>
         </w:rPr>
-        <w:t>weighted count</w:t>
+        <w:t xml:space="preserve"> </w:t>
       </w:r>
       <w:r>
         <w:rPr>
@@ -449,6 +513,62 @@
           <w:iCs/>
           <w:lang w:val="en-US"/>
         </w:rPr>
+        <w:t>1936</w:t>
+      </w:r>
+      <w:r>
+        <w:rPr>
+          <w:i/>
+          <w:iCs/>
+          <w:lang w:val="en-US"/>
+        </w:rPr>
+        <w:t>-</w:t>
+      </w:r>
+      <w:r>
+        <w:rPr>
+          <w:i/>
+          <w:iCs/>
+          <w:lang w:val="en-US"/>
+        </w:rPr>
+        <w:t>1955 = 100 x (spanish-born arrived</w:t>
+      </w:r>
+      <w:r>
+        <w:rPr>
+          <w:i/>
+          <w:iCs/>
+          <w:lang w:val="en-US"/>
+        </w:rPr>
+        <w:t xml:space="preserve"> in</w:t>
+      </w:r>
+      <w:r>
+        <w:rPr>
+          <w:i/>
+          <w:iCs/>
+          <w:lang w:val="en-US"/>
+        </w:rPr>
+        <w:t xml:space="preserve"> 1936-1955, weighted count) / (total 1970 municipal population</w:t>
+      </w:r>
+      <w:r>
+        <w:rPr>
+          <w:i/>
+          <w:iCs/>
+          <w:lang w:val="en-US"/>
+        </w:rPr>
+        <w:t xml:space="preserve">, </w:t>
+      </w:r>
+      <w:r>
+        <w:rPr>
+          <w:i/>
+          <w:iCs/>
+          <w:lang w:val="en-US"/>
+        </w:rPr>
+        <w:t>weighted count</w:t>
+      </w:r>
+      <w:r>
+        <w:rPr>
+          <w:i/>
+          <w:iCs/>
+          <w:lang w:val="en-US"/>
+        </w:rPr>
         <w:t>).</w:t>
       </w:r>
     </w:p>
@@ -467,7 +587,61 @@
           <w:color w:val="2E75B6"/>
           <w:lang w:val="en-US"/>
         </w:rPr>
-        <w:t>2.2 share_1956_1978</w:t>
+        <w:t xml:space="preserve">2.2 </w:t>
+      </w:r>
+      <w:r>
+        <w:rPr>
+          <w:b/>
+          <w:bCs/>
+          <w:color w:val="2E75B6"/>
+          <w:lang w:val="en-US"/>
+        </w:rPr>
+        <w:t xml:space="preserve">Spanish </w:t>
+      </w:r>
+      <w:r>
+        <w:rPr>
+          <w:b/>
+          <w:bCs/>
+          <w:color w:val="2E75B6"/>
+          <w:lang w:val="en-US"/>
+        </w:rPr>
+        <w:t>share</w:t>
+      </w:r>
+      <w:r>
+        <w:rPr>
+          <w:b/>
+          <w:bCs/>
+          <w:color w:val="2E75B6"/>
+          <w:lang w:val="en-US"/>
+        </w:rPr>
+        <w:t xml:space="preserve"> </w:t>
+      </w:r>
+      <w:r>
+        <w:rPr>
+          <w:b/>
+          <w:bCs/>
+          <w:color w:val="2E75B6"/>
+          <w:lang w:val="en-US"/>
+        </w:rPr>
+        <w:t>1956</w:t>
+      </w:r>
+      <w:r>
+        <w:rPr>
+          <w:b/>
+          <w:bCs/>
+          <w:color w:val="2E75B6"/>
+          <w:lang w:val="en-US"/>
+        </w:rPr>
+        <w:t>-</w:t>
+      </w:r>
+      <w:r>
+        <w:rPr>
+          <w:b/>
+          <w:bCs/>
+          <w:color w:val="2E75B6"/>
+          <w:lang w:val="en-US"/>
+        </w:rPr>
+        <w:t>1978</w:t>
       </w:r>
     </w:p>
     <w:p>
@@ -506,7 +680,7 @@
     <w:p>
       <w:pPr>
         <w:pStyle w:val="Ttulo2"/>
-        <w:spacing w:before="200" w:after="80" w:line="276" w:lineRule="auto"/>
+        <w:spacing w:before="240" w:after="240" w:line="276" w:lineRule="auto"/>
         <w:jc w:val="both"/>
         <w:rPr>
           <w:color w:val="auto"/>
@@ -523,6 +697,533 @@
           <w:lang w:val="en-US"/>
         </w:rPr>
         <w:t>For robustness checks, we also construct measures of the share of the Spanish-born population without separating arrivals into different migration windows (share_36_78_c70 and share_36_78_c80). These variables pool arrivals into a single broad period using either the 1970 or the 1980 census, respectively. The 1970-based measure captures arrivals between 1936 and 1970, whereas the 1980-based measure captures arrivals over the full 1936–1978 period.</w:t>
+      </w:r>
+    </w:p>
+    <w:p>
+      <w:pPr>
+        <w:pStyle w:val="Ttulo1"/>
+        <w:spacing w:before="240" w:after="240" w:line="276" w:lineRule="auto"/>
+        <w:rPr>
+          <w:lang w:val="en-US"/>
+        </w:rPr>
+      </w:pPr>
+      <w:r>
+        <w:rPr>
+          <w:b/>
+          <w:bCs/>
+          <w:color w:val="1F4E79"/>
+          <w:lang w:val="en-US"/>
+        </w:rPr>
+        <w:t>3. Outcomes</w:t>
+      </w:r>
+    </w:p>
+    <w:p>
+      <w:pPr>
+        <w:pStyle w:val="Ttulo2"/>
+        <w:spacing w:before="240" w:after="240" w:line="276" w:lineRule="auto"/>
+        <w:rPr>
+          <w:lang w:val="en-US"/>
+        </w:rPr>
+      </w:pPr>
+      <w:r>
+        <w:rPr>
+          <w:b/>
+          <w:bCs/>
+          <w:color w:val="2E75B6"/>
+          <w:lang w:val="en-US"/>
+        </w:rPr>
+        <w:t>3.1 Electoral outcomes</w:t>
+      </w:r>
+    </w:p>
+    <w:p>
+      <w:pPr>
+        <w:spacing w:before="240" w:after="240" w:line="276" w:lineRule="auto"/>
+        <w:jc w:val="both"/>
+        <w:rPr>
+          <w:lang w:val="en-US"/>
+        </w:rPr>
+      </w:pPr>
+      <w:r>
+        <w:rPr>
+          <w:lang w:val="en-US"/>
+        </w:rPr>
+        <w:t>E</w:t>
+      </w:r>
+      <w:r>
+        <w:rPr>
+          <w:lang w:val="en-US"/>
+        </w:rPr>
+        <w:t xml:space="preserve">lectoral </w:t>
+      </w:r>
+      <w:r>
+        <w:rPr>
+          <w:lang w:val="en-US"/>
+        </w:rPr>
+        <w:t>outcomes</w:t>
+      </w:r>
+      <w:r>
+        <w:rPr>
+          <w:lang w:val="en-US"/>
+        </w:rPr>
+        <w:t xml:space="preserve"> come from </w:t>
+      </w:r>
+      <w:r>
+        <w:rPr>
+          <w:lang w:val="en-US"/>
+        </w:rPr>
+        <w:t xml:space="preserve">Data </w:t>
+      </w:r>
+      <w:r>
+        <w:rPr>
+          <w:lang w:val="en-US"/>
+        </w:rPr>
+        <w:t>CP and cover national legislative elections for the Chamber of Deputies held in 2011, 2013, 2015, 2017, 2019, 2021, 2023, and 2025. The unit of observation is the municipality × election year × election type (general election or PASO).</w:t>
+      </w:r>
+    </w:p>
+    <w:p>
+      <w:pPr>
+        <w:spacing w:before="240" w:after="240" w:line="276" w:lineRule="auto"/>
+        <w:jc w:val="both"/>
+        <w:rPr>
+          <w:lang w:val="en-US"/>
+        </w:rPr>
+      </w:pPr>
+      <w:r>
+        <w:rPr>
+          <w:b/>
+          <w:bCs/>
+          <w:lang w:val="en-US"/>
+        </w:rPr>
+        <w:t>Blank vote share.</w:t>
+      </w:r>
+      <w:r>
+        <w:rPr>
+          <w:lang w:val="en-US"/>
+        </w:rPr>
+        <w:t xml:space="preserve"> Ratio of blank votes over votes cast in the </w:t>
+      </w:r>
+      <w:r>
+        <w:rPr>
+          <w:lang w:val="en-US"/>
+        </w:rPr>
+        <w:t>municipality</w:t>
+      </w:r>
+      <w:r>
+        <w:rPr>
+          <w:lang w:val="en-US"/>
+        </w:rPr>
+        <w:t xml:space="preserve">, in percent. </w:t>
+      </w:r>
+    </w:p>
+    <w:p>
+      <w:pPr>
+        <w:spacing w:before="240" w:after="240" w:line="276" w:lineRule="auto"/>
+        <w:jc w:val="both"/>
+        <w:rPr>
+          <w:lang w:val="en-US"/>
+        </w:rPr>
+      </w:pPr>
+      <w:r>
+        <w:rPr>
+          <w:b/>
+          <w:bCs/>
+          <w:lang w:val="en-US"/>
+        </w:rPr>
+        <w:t>Voter turnout</w:t>
+      </w:r>
+      <w:r>
+        <w:rPr>
+          <w:b/>
+          <w:bCs/>
+          <w:lang w:val="en-US"/>
+        </w:rPr>
+        <w:t xml:space="preserve">. </w:t>
+      </w:r>
+      <w:r>
+        <w:rPr>
+          <w:lang w:val="en-US"/>
+        </w:rPr>
+        <w:t xml:space="preserve">Ratio of votes cast over registered voters in the </w:t>
+      </w:r>
+      <w:r>
+        <w:rPr>
+          <w:lang w:val="en-US"/>
+        </w:rPr>
+        <w:t>municipality</w:t>
+      </w:r>
+      <w:r>
+        <w:rPr>
+          <w:lang w:val="en-US"/>
+        </w:rPr>
+        <w:t xml:space="preserve">. </w:t>
+      </w:r>
+    </w:p>
+    <w:p>
+      <w:pPr>
+        <w:spacing w:before="240" w:after="240" w:line="276" w:lineRule="auto"/>
+        <w:jc w:val="both"/>
+        <w:rPr>
+          <w:lang w:val="en-US"/>
+        </w:rPr>
+      </w:pPr>
+      <w:r>
+        <w:rPr>
+          <w:b/>
+          <w:bCs/>
+          <w:lang w:val="en-US"/>
+        </w:rPr>
+        <w:t>Ideological vote shares.</w:t>
+      </w:r>
+      <w:r>
+        <w:rPr>
+          <w:lang w:val="en-US"/>
+        </w:rPr>
+        <w:t xml:space="preserve"> </w:t>
+      </w:r>
+      <w:r>
+        <w:rPr>
+          <w:lang w:val="en-US"/>
+        </w:rPr>
+        <w:t xml:space="preserve">Each party running for the Chamber of Deputies is classified into five ideological blocs (left, center-left, center, center-right, and right) and </w:t>
+      </w:r>
+      <w:r>
+        <w:rPr>
+          <w:lang w:val="en-US"/>
+        </w:rPr>
+        <w:t>two-party</w:t>
+      </w:r>
+      <w:r>
+        <w:rPr>
+          <w:lang w:val="en-US"/>
+        </w:rPr>
+        <w:t xml:space="preserve"> families (Peronist and Radical). The classification covers approximately 540 unique parties competing between 2011 and 2025 and was conducted manually with the assistance of AI.</w:t>
+      </w:r>
+      <w:r>
+        <w:rPr>
+          <w:lang w:val="en-US"/>
+        </w:rPr>
+        <w:t xml:space="preserve"> </w:t>
+      </w:r>
+      <w:r>
+        <w:rPr>
+          <w:lang w:val="en-US"/>
+        </w:rPr>
+        <w:t>The vote share of each ideological bloc is computed at the</w:t>
+      </w:r>
+      <w:r>
+        <w:rPr>
+          <w:lang w:val="en-US"/>
+        </w:rPr>
+        <w:t xml:space="preserve"> municipality-</w:t>
+      </w:r>
+      <w:r>
+        <w:rPr>
+          <w:lang w:val="en-US"/>
+        </w:rPr>
+        <w:t>election level as a percentage of valid votes</w:t>
+      </w:r>
+      <w:r>
+        <w:rPr>
+          <w:lang w:val="en-US"/>
+        </w:rPr>
+        <w:t xml:space="preserve"> (excluding</w:t>
+      </w:r>
+      <w:r>
+        <w:rPr>
+          <w:lang w:val="en-US"/>
+        </w:rPr>
+        <w:t xml:space="preserve"> </w:t>
+      </w:r>
+      <w:r>
+        <w:rPr>
+          <w:lang w:val="en-US"/>
+        </w:rPr>
+        <w:t>blank, null, and challenged ballots</w:t>
+      </w:r>
+      <w:r>
+        <w:rPr>
+          <w:lang w:val="en-US"/>
+        </w:rPr>
+        <w:t>)</w:t>
+      </w:r>
+      <w:r>
+        <w:rPr>
+          <w:lang w:val="en-US"/>
+        </w:rPr>
+        <w:t xml:space="preserve">. </w:t>
+      </w:r>
+      <w:r>
+        <w:rPr>
+          <w:lang w:val="en-US"/>
+        </w:rPr>
+        <w:t>We additionally construct broad-left and broad-right vote shares by summing the vote shares of left and center-left parties, and of right and center-right parties, respectively.</w:t>
+      </w:r>
+    </w:p>
+    <w:p>
+      <w:pPr>
+        <w:spacing w:before="240" w:after="240" w:line="276" w:lineRule="auto"/>
+        <w:jc w:val="both"/>
+        <w:rPr>
+          <w:lang w:val="en-US"/>
+        </w:rPr>
+      </w:pPr>
+      <w:r>
+        <w:rPr>
+          <w:b/>
+          <w:bCs/>
+          <w:lang w:val="en-US"/>
+        </w:rPr>
+        <w:t>Incumbency.</w:t>
+      </w:r>
+      <w:r>
+        <w:rPr>
+          <w:lang w:val="en-US"/>
+        </w:rPr>
+        <w:t xml:space="preserve"> For each election year we identify which party in the section represents the incumbent national government (</w:t>
+      </w:r>
+      <w:proofErr w:type="spellStart"/>
+      <w:r>
+        <w:rPr>
+          <w:lang w:val="en-US"/>
+        </w:rPr>
+        <w:t>Kirchnerismo</w:t>
+      </w:r>
+      <w:proofErr w:type="spellEnd"/>
+      <w:r>
+        <w:rPr>
+          <w:lang w:val="en-US"/>
+        </w:rPr>
+        <w:t xml:space="preserve"> 2011-2015, </w:t>
+      </w:r>
+      <w:proofErr w:type="spellStart"/>
+      <w:r>
+        <w:rPr>
+          <w:lang w:val="en-US"/>
+        </w:rPr>
+        <w:t>Cambiemos</w:t>
+      </w:r>
+      <w:proofErr w:type="spellEnd"/>
+      <w:r>
+        <w:rPr>
+          <w:lang w:val="en-US"/>
+        </w:rPr>
+        <w:t xml:space="preserve"> 2017, </w:t>
+      </w:r>
+      <w:proofErr w:type="spellStart"/>
+      <w:r>
+        <w:rPr>
+          <w:lang w:val="en-US"/>
+        </w:rPr>
+        <w:t>JxC</w:t>
+      </w:r>
+      <w:proofErr w:type="spellEnd"/>
+      <w:r>
+        <w:rPr>
+          <w:lang w:val="en-US"/>
+        </w:rPr>
+        <w:t xml:space="preserve"> 2019, Frente de Todos 2021, </w:t>
+      </w:r>
+      <w:r>
+        <w:rPr>
+          <w:lang w:val="en-US"/>
+        </w:rPr>
+        <w:lastRenderedPageBreak/>
+        <w:t>Union por la Patria 2023, La Libertad Avanza 2025). From this we build incumbent vote share</w:t>
+      </w:r>
+      <w:r>
+        <w:rPr>
+          <w:lang w:val="en-US"/>
+        </w:rPr>
+        <w:t xml:space="preserve">, </w:t>
+      </w:r>
+      <w:r>
+        <w:rPr>
+          <w:lang w:val="en-US"/>
+        </w:rPr>
+        <w:t>as a percentage of valid votes</w:t>
+      </w:r>
+      <w:r>
+        <w:rPr>
+          <w:lang w:val="en-US"/>
+        </w:rPr>
+        <w:t xml:space="preserve"> (excluding </w:t>
+      </w:r>
+      <w:r>
+        <w:rPr>
+          <w:lang w:val="en-US"/>
+        </w:rPr>
+        <w:t>blank, null, and challenged ballots</w:t>
+      </w:r>
+      <w:r>
+        <w:rPr>
+          <w:lang w:val="en-US"/>
+        </w:rPr>
+        <w:t>)</w:t>
+      </w:r>
+      <w:r>
+        <w:rPr>
+          <w:lang w:val="en-US"/>
+        </w:rPr>
+        <w:t>.</w:t>
+      </w:r>
+    </w:p>
+    <w:p>
+      <w:pPr>
+        <w:spacing w:before="240" w:after="240" w:line="276" w:lineRule="auto"/>
+        <w:jc w:val="both"/>
+        <w:rPr>
+          <w:lang w:val="en-US"/>
+        </w:rPr>
+      </w:pPr>
+      <w:r>
+        <w:rPr>
+          <w:b/>
+          <w:bCs/>
+          <w:lang w:val="en-US"/>
+        </w:rPr>
+        <w:t xml:space="preserve">Ideological </w:t>
+      </w:r>
+      <w:r>
+        <w:rPr>
+          <w:b/>
+          <w:bCs/>
+          <w:lang w:val="en-US"/>
+        </w:rPr>
+        <w:t>alternation</w:t>
+      </w:r>
+      <w:r>
+        <w:rPr>
+          <w:b/>
+          <w:bCs/>
+          <w:lang w:val="en-US"/>
+        </w:rPr>
+        <w:t>.</w:t>
+      </w:r>
+      <w:r>
+        <w:rPr>
+          <w:b/>
+          <w:bCs/>
+          <w:lang w:val="en-US"/>
+        </w:rPr>
+        <w:t xml:space="preserve"> </w:t>
+      </w:r>
+      <w:r>
+        <w:rPr>
+          <w:lang w:val="en-US"/>
+        </w:rPr>
+        <w:t>Dummy variable indicating</w:t>
+      </w:r>
+      <w:r>
+        <w:rPr>
+          <w:b/>
+          <w:bCs/>
+          <w:lang w:val="en-US"/>
+        </w:rPr>
+        <w:t xml:space="preserve"> </w:t>
+      </w:r>
+      <w:r>
+        <w:rPr>
+          <w:lang w:val="en-US"/>
+        </w:rPr>
+        <w:t>whether the winning ideological bloc changes between consecutive elections</w:t>
+      </w:r>
+      <w:r>
+        <w:rPr>
+          <w:lang w:val="en-US"/>
+        </w:rPr>
+        <w:t xml:space="preserve"> of the same type.</w:t>
+      </w:r>
+    </w:p>
+    <w:p>
+      <w:pPr>
+        <w:pStyle w:val="Ttulo2"/>
+        <w:spacing w:before="240" w:after="240" w:line="276" w:lineRule="auto"/>
+        <w:rPr>
+          <w:lang w:val="en-US"/>
+        </w:rPr>
+      </w:pPr>
+      <w:r>
+        <w:rPr>
+          <w:b/>
+          <w:bCs/>
+          <w:color w:val="2E75B6"/>
+          <w:lang w:val="en-US"/>
+        </w:rPr>
+        <w:t>3.2 Migration outcomes (individual x LAPOP round)</w:t>
+      </w:r>
+    </w:p>
+    <w:p>
+      <w:pPr>
+        <w:pStyle w:val="p1"/>
+        <w:jc w:val="both"/>
+        <w:rPr>
+          <w:rFonts w:ascii="Cambria" w:eastAsia="Cambria" w:hAnsi="Cambria" w:cs="Cambria"/>
+          <w:sz w:val="22"/>
+          <w:szCs w:val="22"/>
+          <w:lang w:val="en-US"/>
+        </w:rPr>
+      </w:pPr>
+      <w:r>
+        <w:rPr>
+          <w:rFonts w:ascii="Cambria" w:eastAsia="Cambria" w:hAnsi="Cambria" w:cs="Cambria"/>
+          <w:sz w:val="22"/>
+          <w:szCs w:val="22"/>
+          <w:lang w:val="en-US"/>
+        </w:rPr>
+        <w:t>Migration outcom</w:t>
+      </w:r>
+      <w:r>
+        <w:rPr>
+          <w:rFonts w:ascii="Cambria" w:eastAsia="Cambria" w:hAnsi="Cambria" w:cs="Cambria"/>
+          <w:sz w:val="22"/>
+          <w:szCs w:val="22"/>
+          <w:lang w:val="en-US"/>
+        </w:rPr>
+        <w:t>e</w:t>
+      </w:r>
+      <w:r>
+        <w:rPr>
+          <w:rFonts w:ascii="Cambria" w:eastAsia="Cambria" w:hAnsi="Cambria" w:cs="Cambria"/>
+          <w:sz w:val="22"/>
+          <w:szCs w:val="22"/>
+          <w:lang w:val="en-US"/>
+        </w:rPr>
+        <w:t xml:space="preserve"> come from the LAPOP surveys conducted in Argentina in 2012, 2014, 2017, 2019, and 2023. The unit of observation is the individual × survey round, and the sample covers respondents residing in 56 municipalities.</w:t>
+      </w:r>
+    </w:p>
+    <w:p>
+      <w:pPr>
+        <w:spacing w:before="240" w:after="240" w:line="276" w:lineRule="auto"/>
+        <w:jc w:val="both"/>
+        <w:rPr>
+          <w:lang w:val="en-US"/>
+        </w:rPr>
+      </w:pPr>
+      <w:r>
+        <w:rPr>
+          <w:b/>
+          <w:bCs/>
+          <w:lang w:val="en-US"/>
+        </w:rPr>
+        <w:t>Migration intention.</w:t>
+      </w:r>
+      <w:r>
+        <w:rPr>
+          <w:lang w:val="en-US"/>
+        </w:rPr>
+        <w:t xml:space="preserve"> LAPOP question </w:t>
+      </w:r>
+      <w:r>
+        <w:rPr>
+          <w:lang w:val="en-US"/>
+        </w:rPr>
+        <w:t>Q14</w:t>
+      </w:r>
+      <w:r>
+        <w:rPr>
+          <w:lang w:val="en-US"/>
+        </w:rPr>
+        <w:t>: "Do you have any intention of going to live or work in another country in the next three years?" Coded 1 = yes, 0 = no.</w:t>
       </w:r>
     </w:p>
     <w:p>
@@ -540,7 +1241,7 @@
           <w:color w:val="1F4E79"/>
           <w:lang w:val="en-US"/>
         </w:rPr>
-        <w:t>3. Outcomes</w:t>
+        <w:t>4. Merging the Datasets</w:t>
       </w:r>
     </w:p>
     <w:p>
@@ -558,348 +1259,7 @@
           <w:color w:val="2E75B6"/>
           <w:lang w:val="en-US"/>
         </w:rPr>
-        <w:t>3.1 Electoral outcomes (municipal x election year x election type)</w:t>
-      </w:r>
-    </w:p>
-    <w:p>
-      <w:pPr>
-        <w:spacing w:before="60" w:after="60" w:line="276" w:lineRule="auto"/>
-        <w:jc w:val="both"/>
-        <w:rPr>
-          <w:lang w:val="en-US"/>
-        </w:rPr>
-      </w:pPr>
-      <w:r>
-        <w:rPr>
-          <w:b/>
-          <w:bCs/>
-          <w:lang w:val="en-US"/>
-        </w:rPr>
-        <w:t>Source:</w:t>
-      </w:r>
-      <w:r>
-        <w:rPr>
-          <w:lang w:val="en-US"/>
-        </w:rPr>
-        <w:t xml:space="preserve"> </w:t>
-      </w:r>
-      <w:r>
-        <w:rPr>
-          <w:lang w:val="en-US"/>
-        </w:rPr>
-        <w:t>DATA CP.</w:t>
-      </w:r>
-      <w:r>
-        <w:rPr>
-          <w:lang w:val="en-US"/>
-        </w:rPr>
-        <w:t xml:space="preserve"> National legislative elections (Chamber of Deputies) for 2011, 2013, 2015, 2017, 2019, 2021, 2023 and 2025. Unit of observation: municipality</w:t>
-      </w:r>
-      <w:r>
-        <w:rPr>
-          <w:lang w:val="en-US"/>
-        </w:rPr>
-        <w:t xml:space="preserve"> </w:t>
-      </w:r>
-      <w:r>
-        <w:rPr>
-          <w:lang w:val="en-US"/>
-        </w:rPr>
-        <w:t>by year by election type (General or PASO).</w:t>
-      </w:r>
-    </w:p>
-    <w:p>
-      <w:pPr>
-        <w:spacing w:before="60" w:after="60" w:line="276" w:lineRule="auto"/>
-        <w:jc w:val="both"/>
-        <w:rPr>
-          <w:lang w:val="en-US"/>
-        </w:rPr>
-      </w:pPr>
-      <w:r>
-        <w:rPr>
-          <w:b/>
-          <w:bCs/>
-          <w:lang w:val="en-US"/>
-        </w:rPr>
-        <w:t>Blank vote share.</w:t>
-      </w:r>
-      <w:r>
-        <w:rPr>
-          <w:lang w:val="en-US"/>
-        </w:rPr>
-        <w:t xml:space="preserve"> Ratio of blank votes over votes cast in the section, in percent. </w:t>
-      </w:r>
-    </w:p>
-    <w:p>
-      <w:pPr>
-        <w:spacing w:before="60" w:after="60" w:line="276" w:lineRule="auto"/>
-        <w:jc w:val="both"/>
-        <w:rPr>
-          <w:lang w:val="en-US"/>
-        </w:rPr>
-      </w:pPr>
-      <w:r>
-        <w:rPr>
-          <w:b/>
-          <w:bCs/>
-          <w:lang w:val="en-US"/>
-        </w:rPr>
-        <w:t>Voter turnout</w:t>
-      </w:r>
-      <w:r>
-        <w:rPr>
-          <w:b/>
-          <w:bCs/>
-          <w:lang w:val="en-US"/>
-        </w:rPr>
-        <w:t xml:space="preserve">. </w:t>
-      </w:r>
-      <w:r>
-        <w:rPr>
-          <w:lang w:val="en-US"/>
-        </w:rPr>
-        <w:t xml:space="preserve">Ratio of votes cast over registered voters in the section. </w:t>
-      </w:r>
-    </w:p>
-    <w:p>
-      <w:pPr>
-        <w:spacing w:before="60" w:after="60" w:line="276" w:lineRule="auto"/>
-        <w:jc w:val="both"/>
-        <w:rPr>
-          <w:lang w:val="en-US"/>
-        </w:rPr>
-      </w:pPr>
-      <w:r>
-        <w:rPr>
-          <w:b/>
-          <w:bCs/>
-          <w:lang w:val="en-US"/>
-        </w:rPr>
-        <w:t>Ideological vote shares.</w:t>
-      </w:r>
-      <w:r>
-        <w:rPr>
-          <w:lang w:val="en-US"/>
-        </w:rPr>
-        <w:t xml:space="preserve"> </w:t>
-      </w:r>
-      <w:r>
-        <w:rPr>
-          <w:lang w:val="en-US"/>
-        </w:rPr>
-        <w:t xml:space="preserve">Each party running for the Chamber of Deputies is classified into five ideological blocs (left, center-left, center, center-right, and right) and </w:t>
-      </w:r>
-      <w:r>
-        <w:rPr>
-          <w:lang w:val="en-US"/>
-        </w:rPr>
-        <w:t>two-party</w:t>
-      </w:r>
-      <w:r>
-        <w:rPr>
-          <w:lang w:val="en-US"/>
-        </w:rPr>
-        <w:t xml:space="preserve"> families (Peronist and Radical). The classification covers approximately 540 unique parties competing between 2011 and 2025 and was conducted manually with the assistance of AI</w:t>
-      </w:r>
-      <w:r>
-        <w:rPr>
-          <w:lang w:val="en-US"/>
-        </w:rPr>
-        <w:t xml:space="preserve"> </w:t>
-      </w:r>
-      <w:r>
-        <w:rPr>
-          <w:lang w:val="en-US"/>
-        </w:rPr>
-        <w:t>.</w:t>
-      </w:r>
-      <w:r>
-        <w:rPr>
-          <w:lang w:val="en-US"/>
-        </w:rPr>
-        <w:t>The vote share of each ideological bloc is computed at the</w:t>
-      </w:r>
-      <w:r>
-        <w:rPr>
-          <w:lang w:val="en-US"/>
-        </w:rPr>
-        <w:t xml:space="preserve"> municipality-</w:t>
-      </w:r>
-      <w:r>
-        <w:rPr>
-          <w:lang w:val="en-US"/>
-        </w:rPr>
-        <w:t>election level as a percentage of valid votes</w:t>
-      </w:r>
-      <w:r>
-        <w:rPr>
-          <w:lang w:val="en-US"/>
-        </w:rPr>
-        <w:t xml:space="preserve"> (excluding</w:t>
-      </w:r>
-      <w:r>
-        <w:rPr>
-          <w:lang w:val="en-US"/>
-        </w:rPr>
-        <w:t xml:space="preserve"> </w:t>
-      </w:r>
-      <w:r>
-        <w:rPr>
-          <w:lang w:val="en-US"/>
-        </w:rPr>
-        <w:t>blank, null, and challenged ballots</w:t>
-      </w:r>
-      <w:r>
-        <w:rPr>
-          <w:lang w:val="en-US"/>
-        </w:rPr>
-        <w:t>)</w:t>
-      </w:r>
-      <w:r>
-        <w:rPr>
-          <w:lang w:val="en-US"/>
-        </w:rPr>
-        <w:t xml:space="preserve">. </w:t>
-      </w:r>
-      <w:r>
-        <w:rPr>
-          <w:lang w:val="en-US"/>
-        </w:rPr>
-        <w:t>We additionally construct broad-left and broad-right vote shares by summing the vote shares of left and center-left parties, and of right and center-right parties, respectively.</w:t>
-      </w:r>
-    </w:p>
-    <w:p>
-      <w:pPr>
-        <w:spacing w:before="60" w:after="60" w:line="276" w:lineRule="auto"/>
-        <w:jc w:val="both"/>
-        <w:rPr>
-          <w:lang w:val="en-US"/>
-        </w:rPr>
-      </w:pPr>
-      <w:r>
-        <w:rPr>
-          <w:b/>
-          <w:bCs/>
-          <w:lang w:val="en-US"/>
-        </w:rPr>
-        <w:t>Incumbency and electoral dynamics.</w:t>
-      </w:r>
-      <w:r>
-        <w:rPr>
-          <w:lang w:val="en-US"/>
-        </w:rPr>
-        <w:t xml:space="preserve"> For each election year we identify which party in the section represents the incumbent national government (Kirchnerismo 2011-2015, Cambiemos 2017, JxC </w:t>
-      </w:r>
-      <w:r>
-        <w:rPr>
-          <w:lang w:val="en-US"/>
-        </w:rPr>
-        <w:lastRenderedPageBreak/>
-        <w:t>2019, Frente de Todos 2021, Union por la Patria 2023, La Libertad Avanza 2025). From this we build incumbent vote share</w:t>
-      </w:r>
-      <w:r>
-        <w:rPr>
-          <w:lang w:val="en-US"/>
-        </w:rPr>
-        <w:t xml:space="preserve">, </w:t>
-      </w:r>
-      <w:r>
-        <w:rPr>
-          <w:lang w:val="en-US"/>
-        </w:rPr>
-        <w:t>as a percentage of valid votes</w:t>
-      </w:r>
-      <w:r>
-        <w:rPr>
-          <w:lang w:val="en-US"/>
-        </w:rPr>
-        <w:t xml:space="preserve"> (excluding </w:t>
-      </w:r>
-      <w:r>
-        <w:rPr>
-          <w:lang w:val="en-US"/>
-        </w:rPr>
-        <w:t>blank, null, and challenged ballots</w:t>
-      </w:r>
-      <w:r>
-        <w:rPr>
-          <w:lang w:val="en-US"/>
-        </w:rPr>
-        <w:t>)</w:t>
-      </w:r>
-      <w:r>
-        <w:rPr>
-          <w:lang w:val="en-US"/>
-        </w:rPr>
-        <w:t>.</w:t>
-      </w:r>
-    </w:p>
-    <w:p>
-      <w:pPr>
-        <w:spacing w:before="60" w:after="60" w:line="276" w:lineRule="auto"/>
-        <w:jc w:val="both"/>
-        <w:rPr>
-          <w:lang w:val="en-US"/>
-        </w:rPr>
-      </w:pPr>
-      <w:r>
-        <w:rPr>
-          <w:b/>
-          <w:bCs/>
-          <w:lang w:val="en-US"/>
-        </w:rPr>
-        <w:t xml:space="preserve">Ideological </w:t>
-      </w:r>
-      <w:r>
-        <w:rPr>
-          <w:b/>
-          <w:bCs/>
-          <w:lang w:val="en-US"/>
-        </w:rPr>
-        <w:t>alternation</w:t>
-      </w:r>
-      <w:r>
-        <w:rPr>
-          <w:b/>
-          <w:bCs/>
-          <w:lang w:val="en-US"/>
-        </w:rPr>
-        <w:t>.</w:t>
-      </w:r>
-      <w:r>
-        <w:rPr>
-          <w:b/>
-          <w:bCs/>
-          <w:lang w:val="en-US"/>
-        </w:rPr>
-        <w:t xml:space="preserve"> </w:t>
-      </w:r>
-      <w:r>
-        <w:rPr>
-          <w:lang w:val="en-US"/>
-        </w:rPr>
-        <w:t>Dummy variable indicating</w:t>
-      </w:r>
-      <w:r>
-        <w:rPr>
-          <w:b/>
-          <w:bCs/>
-          <w:lang w:val="en-US"/>
-        </w:rPr>
-        <w:t xml:space="preserve"> </w:t>
-      </w:r>
-      <w:r>
-        <w:rPr>
-          <w:lang w:val="en-US"/>
-        </w:rPr>
-        <w:t>whether the winning ideological bloc changes between consecutive elections</w:t>
-      </w:r>
-      <w:r>
-        <w:rPr>
-          <w:lang w:val="en-US"/>
-        </w:rPr>
-        <w:t xml:space="preserve"> of the same type.</w:t>
+        <w:t>4.1 Common municipal identifier</w:t>
       </w:r>
     </w:p>
     <w:p>
@@ -907,6 +1267,48 @@
         <w:pStyle w:val="Ttulo2"/>
         <w:spacing w:before="200" w:after="80" w:line="276" w:lineRule="auto"/>
         <w:rPr>
+          <w:color w:val="auto"/>
+          <w:sz w:val="22"/>
+          <w:szCs w:val="22"/>
+          <w:lang w:val="en-US"/>
+        </w:rPr>
+      </w:pPr>
+      <w:r>
+        <w:rPr>
+          <w:color w:val="auto"/>
+          <w:sz w:val="22"/>
+          <w:szCs w:val="22"/>
+          <w:lang w:val="en-US"/>
+        </w:rPr>
+        <w:t>All datasets are harmonized to a common municipality-level identifier based on the six-digit IPUMS code, in which the first three digits identify the province and the last three identify the municipality. The datasets are linked using the procedures described below, and the resulting database identifies municipalities using this harmonized IPUMS-based code.</w:t>
+      </w:r>
+    </w:p>
+    <w:p>
+      <w:pPr>
+        <w:pStyle w:val="Ttulo2"/>
+        <w:spacing w:before="200" w:after="80" w:line="276" w:lineRule="auto"/>
+        <w:rPr>
+          <w:color w:val="auto"/>
+          <w:sz w:val="22"/>
+          <w:szCs w:val="22"/>
+          <w:lang w:val="en-US"/>
+        </w:rPr>
+      </w:pPr>
+      <w:r>
+        <w:rPr>
+          <w:color w:val="auto"/>
+          <w:sz w:val="22"/>
+          <w:szCs w:val="22"/>
+          <w:lang w:val="en-US"/>
+        </w:rPr>
+        <w:t>Because IPUMS provides a harmonized municipality code across census years, the 1970, 1980, and 2010 censuses can be linked directly using this identifier.</w:t>
+      </w:r>
+    </w:p>
+    <w:p>
+      <w:pPr>
+        <w:pStyle w:val="Ttulo2"/>
+        <w:spacing w:before="200" w:after="80" w:line="276" w:lineRule="auto"/>
+        <w:rPr>
           <w:lang w:val="en-US"/>
         </w:rPr>
       </w:pPr>
@@ -917,122 +1319,285 @@
           <w:color w:val="2E75B6"/>
           <w:lang w:val="en-US"/>
         </w:rPr>
-        <w:t>3.2 Migration outcomes (individual x LAPOP round)</w:t>
-      </w:r>
-    </w:p>
-    <w:p>
-      <w:pPr>
-        <w:spacing w:before="60" w:after="60" w:line="276" w:lineRule="auto"/>
-        <w:jc w:val="both"/>
-        <w:rPr>
-          <w:lang w:val="en-US"/>
-        </w:rPr>
-      </w:pPr>
-      <w:r>
-        <w:rPr>
-          <w:b/>
-          <w:bCs/>
-          <w:lang w:val="en-US"/>
-        </w:rPr>
-        <w:t>Migration intention.</w:t>
-      </w:r>
-      <w:r>
-        <w:rPr>
-          <w:lang w:val="en-US"/>
-        </w:rPr>
-        <w:t xml:space="preserve"> LAPOP question </w:t>
+        <w:t>4.2 Census to Electoral data — via municipal polygons</w:t>
+      </w:r>
+    </w:p>
+    <w:p>
+      <w:pPr>
+        <w:pStyle w:val="Ttulo2"/>
+        <w:spacing w:before="200" w:after="80" w:line="276" w:lineRule="auto"/>
+        <w:jc w:val="both"/>
+        <w:rPr>
+          <w:color w:val="auto"/>
+          <w:sz w:val="22"/>
+          <w:szCs w:val="22"/>
+          <w:lang w:val="en-US"/>
+        </w:rPr>
+      </w:pPr>
+      <w:r>
+        <w:rPr>
+          <w:color w:val="auto"/>
+          <w:sz w:val="22"/>
+          <w:szCs w:val="22"/>
+          <w:lang w:val="en-US"/>
+        </w:rPr>
+        <w:t>Because there is no common geographic identifier linking the electoral and IPUMS census data, we match the two datasets spatially using the harmonized 1970–2010 IPUMS municipality shapefile and the electoral-section shapefile from the CP electoral data.</w:t>
+      </w:r>
+    </w:p>
+    <w:p>
+      <w:pPr>
+        <w:pStyle w:val="Ttulo2"/>
+        <w:spacing w:before="200" w:after="80" w:line="276" w:lineRule="auto"/>
+        <w:jc w:val="both"/>
+        <w:rPr>
+          <w:color w:val="auto"/>
+          <w:sz w:val="22"/>
+          <w:szCs w:val="22"/>
+          <w:lang w:val="en-US"/>
+        </w:rPr>
+      </w:pPr>
+      <w:r>
+        <w:rPr>
+          <w:color w:val="auto"/>
+          <w:sz w:val="22"/>
+          <w:szCs w:val="22"/>
+          <w:lang w:val="en-US"/>
+        </w:rPr>
+        <w:t>Argentine electoral sections do not map one-to-one onto census municipalities. Municipalities typically contain several electoral sections, while some electoral-section boundaries cross municipal borders. Consequently, no municipality coincides exactly with a single electoral-section polygon. For each electoral section, we therefore calculate its spatial intersection with all census municipalities and assign it to the municipality with which it shares the largest area of overlap.</w:t>
+      </w:r>
+    </w:p>
+    <w:p>
+      <w:pPr>
+        <w:pStyle w:val="Ttulo2"/>
+        <w:spacing w:before="200" w:after="80" w:line="276" w:lineRule="auto"/>
+        <w:jc w:val="both"/>
+        <w:rPr>
+          <w:color w:val="auto"/>
+          <w:sz w:val="22"/>
+          <w:szCs w:val="22"/>
+          <w:lang w:val="en-US"/>
+        </w:rPr>
+      </w:pPr>
+      <w:r>
+        <w:rPr>
+          <w:color w:val="auto"/>
+          <w:sz w:val="22"/>
+          <w:szCs w:val="22"/>
+          <w:lang w:val="en-US"/>
+        </w:rPr>
+        <w:t>A potential concern is that an electoral section may be distributed relatively evenly across multiple municipalities. To assess this, we calculate the share of each section’s area that overlaps with its assigned municipality. The minimum overlap is 70 percent, indicating that every electoral section lies predominantly within a single municipality.</w:t>
+      </w:r>
+    </w:p>
+    <w:p>
+      <w:pPr>
+        <w:pStyle w:val="Ttulo2"/>
+        <w:spacing w:before="200" w:after="80" w:line="276" w:lineRule="auto"/>
+        <w:rPr>
+          <w:lang w:val="en-US"/>
+        </w:rPr>
+      </w:pPr>
+      <w:r>
+        <w:rPr>
+          <w:b/>
+          <w:bCs/>
+          <w:color w:val="2E75B6"/>
+          <w:lang w:val="en-US"/>
+        </w:rPr>
+        <w:t>4.3 Census to LAPOP — name matching plus manual review</w:t>
+      </w:r>
+    </w:p>
+    <w:p>
+      <w:pPr>
+        <w:pStyle w:val="Ttulo2"/>
+        <w:spacing w:before="200" w:after="80" w:line="276" w:lineRule="auto"/>
+        <w:jc w:val="both"/>
+        <w:rPr>
+          <w:color w:val="auto"/>
+          <w:sz w:val="22"/>
+          <w:szCs w:val="22"/>
+          <w:lang w:val="en-US"/>
+        </w:rPr>
+      </w:pPr>
+      <w:r>
+        <w:rPr>
+          <w:color w:val="auto"/>
+          <w:sz w:val="22"/>
+          <w:szCs w:val="22"/>
+          <w:lang w:val="en-US"/>
+        </w:rPr>
+        <w:lastRenderedPageBreak/>
+        <w:t>LAPOP identifies respondents’ locations using province and municipality names recorded as text fields. To merge the LAPOP data with the IPUMS census data, we followed a three-step procedure.</w:t>
+      </w:r>
+    </w:p>
+    <w:p>
+      <w:pPr>
+        <w:pStyle w:val="Ttulo2"/>
+        <w:spacing w:before="200" w:after="80" w:line="276" w:lineRule="auto"/>
+        <w:jc w:val="both"/>
+        <w:rPr>
+          <w:color w:val="auto"/>
+          <w:sz w:val="22"/>
+          <w:szCs w:val="22"/>
+          <w:lang w:val="en-US"/>
+        </w:rPr>
+      </w:pPr>
+      <w:r>
+        <w:rPr>
+          <w:color w:val="auto"/>
+          <w:sz w:val="22"/>
+          <w:szCs w:val="22"/>
+          <w:lang w:val="en-US"/>
+        </w:rPr>
+        <w:t>First, we standardized the LAPOP province and municipality names by removing accents, converting all text to uppercase, and trimming excess whitespace. We also harmonized the treatment of CABA, AMBA, and the Province of Buenos Aires</w:t>
+      </w:r>
+      <w:r>
+        <w:rPr>
+          <w:color w:val="auto"/>
+          <w:sz w:val="22"/>
+          <w:szCs w:val="22"/>
+          <w:lang w:val="en-US"/>
+        </w:rPr>
+        <w:t xml:space="preserve"> to match IPUMS labels</w:t>
+      </w:r>
+      <w:r>
+        <w:rPr>
+          <w:color w:val="auto"/>
+          <w:sz w:val="22"/>
+          <w:szCs w:val="22"/>
+          <w:lang w:val="en-US"/>
+        </w:rPr>
+        <w:t xml:space="preserve">. CABA and its </w:t>
       </w:r>
       <w:r>
         <w:rPr>
           <w:i/>
           <w:iCs/>
-          <w:lang w:val="en-US"/>
-        </w:rPr>
-        <w:t>Q14</w:t>
-      </w:r>
-      <w:r>
-        <w:rPr>
-          <w:lang w:val="en-US"/>
-        </w:rPr>
-        <w:t>: "Do you have any intention of going to live or work in another country in the next three years?" Coded 1 = yes, 0 = no.</w:t>
-      </w:r>
-    </w:p>
-    <w:p>
-      <w:pPr>
-        <w:pStyle w:val="Ttulo1"/>
-        <w:spacing w:before="240" w:after="120" w:line="276" w:lineRule="auto"/>
-        <w:rPr>
-          <w:lang w:val="en-US"/>
-        </w:rPr>
-      </w:pPr>
-      <w:r>
-        <w:rPr>
-          <w:b/>
-          <w:bCs/>
-          <w:color w:val="1F4E79"/>
-          <w:lang w:val="en-US"/>
-        </w:rPr>
-        <w:t>4. Merging the Datasets</w:t>
+          <w:color w:val="auto"/>
+          <w:sz w:val="22"/>
+          <w:szCs w:val="22"/>
+          <w:lang w:val="en-US"/>
+        </w:rPr>
+        <w:t>comunas</w:t>
+      </w:r>
+      <w:r>
+        <w:rPr>
+          <w:color w:val="auto"/>
+          <w:sz w:val="22"/>
+          <w:szCs w:val="22"/>
+          <w:lang w:val="en-US"/>
+        </w:rPr>
+        <w:t xml:space="preserve"> were recoded as “CITY OF BUENOS AIRES,” whereas AMBA and Provincia de Buenos Aires were recoded as “BUENOS AIRES.” In addition, because IPUMS labels provincial capital municipalities as “CAPITAL”</w:t>
+      </w:r>
+      <w:r>
+        <w:rPr>
+          <w:color w:val="auto"/>
+          <w:sz w:val="22"/>
+          <w:szCs w:val="22"/>
+          <w:lang w:val="en-US"/>
+        </w:rPr>
+        <w:t>,</w:t>
+      </w:r>
+      <w:r>
+        <w:rPr>
+          <w:color w:val="auto"/>
+          <w:sz w:val="22"/>
+          <w:szCs w:val="22"/>
+          <w:lang w:val="en-US"/>
+        </w:rPr>
+        <w:t xml:space="preserve"> we recoded the corresponding LAPOP municipality names accordingly.</w:t>
       </w:r>
     </w:p>
     <w:p>
       <w:pPr>
         <w:pStyle w:val="Ttulo2"/>
         <w:spacing w:before="200" w:after="80" w:line="276" w:lineRule="auto"/>
-        <w:rPr>
-          <w:lang w:val="en-US"/>
-        </w:rPr>
-      </w:pPr>
-      <w:r>
-        <w:rPr>
-          <w:b/>
-          <w:bCs/>
-          <w:color w:val="2E75B6"/>
-          <w:lang w:val="en-US"/>
-        </w:rPr>
-        <w:t>4.1 Common municipal identifier</w:t>
+        <w:jc w:val="both"/>
+        <w:rPr>
+          <w:color w:val="auto"/>
+          <w:sz w:val="22"/>
+          <w:szCs w:val="22"/>
+          <w:lang w:val="en-US"/>
+        </w:rPr>
+      </w:pPr>
+      <w:r>
+        <w:rPr>
+          <w:color w:val="auto"/>
+          <w:sz w:val="22"/>
+          <w:szCs w:val="22"/>
+          <w:lang w:val="en-US"/>
+        </w:rPr>
+        <w:t>Second, we constructed a crosswalk of all province–municipality pairs appearing in LAPOP and in the harmonized census data, initially matching observations by exact equality of the cleaned province and municipality names.</w:t>
       </w:r>
     </w:p>
     <w:p>
       <w:pPr>
         <w:pStyle w:val="Ttulo2"/>
         <w:spacing w:before="200" w:after="80" w:line="276" w:lineRule="auto"/>
-        <w:rPr>
-          <w:color w:val="auto"/>
-          <w:sz w:val="22"/>
-          <w:szCs w:val="22"/>
-          <w:lang w:val="en-US"/>
-        </w:rPr>
-      </w:pPr>
-      <w:r>
-        <w:rPr>
-          <w:color w:val="auto"/>
-          <w:sz w:val="22"/>
-          <w:szCs w:val="22"/>
-          <w:lang w:val="en-US"/>
-        </w:rPr>
-        <w:t>All datasets are harmonized to a common municipality-level identifier based on the six-digit IPUMS code, in which the first three digits identify the province and the last three identify the municipality. The datasets are linked using the procedures described below, and the resulting database identifies municipalities using this harmonized IPUMS-based code.</w:t>
+        <w:jc w:val="both"/>
+        <w:rPr>
+          <w:color w:val="auto"/>
+          <w:sz w:val="22"/>
+          <w:szCs w:val="22"/>
+        </w:rPr>
+      </w:pPr>
+      <w:r>
+        <w:rPr>
+          <w:color w:val="auto"/>
+          <w:sz w:val="22"/>
+          <w:szCs w:val="22"/>
+          <w:lang w:val="en-US"/>
+        </w:rPr>
+        <w:t xml:space="preserve">Third, we manually resolved the unmatched pairs. Approximately 58 LAPOP localities did not match directly, generally because LAPOP reports the name of a locality located within a larger census municipality. For each of these cases, we identified the corresponding census municipality and recorded the correction in a hard-coded </w:t>
+      </w:r>
+      <w:r>
+        <w:rPr>
+          <w:i/>
+          <w:iCs/>
+          <w:color w:val="auto"/>
+          <w:sz w:val="22"/>
+          <w:szCs w:val="22"/>
+          <w:lang w:val="en-US"/>
+        </w:rPr>
+        <w:t>case_when</w:t>
+      </w:r>
+      <w:r>
+        <w:rPr>
+          <w:color w:val="auto"/>
+          <w:sz w:val="22"/>
+          <w:szCs w:val="22"/>
+          <w:lang w:val="en-US"/>
+        </w:rPr>
+        <w:t xml:space="preserve"> block. </w:t>
+      </w:r>
+      <w:r>
+        <w:rPr>
+          <w:color w:val="auto"/>
+          <w:sz w:val="22"/>
+          <w:szCs w:val="22"/>
+        </w:rPr>
+        <w:t>Examples include SARANDÍ → AVELLANEDA in Buenos Aires, MAR DEL PLATA → GENERAL PUEYRREDÓN, SANTA ROSA → CAPITAL in La Pampa, and VILLA CARLOS PAZ → PUNILLA in Córdoba.</w:t>
       </w:r>
     </w:p>
     <w:p>
       <w:pPr>
         <w:pStyle w:val="Ttulo2"/>
         <w:spacing w:before="200" w:after="80" w:line="276" w:lineRule="auto"/>
-        <w:rPr>
-          <w:color w:val="auto"/>
-          <w:sz w:val="22"/>
-          <w:szCs w:val="22"/>
-          <w:lang w:val="en-US"/>
-        </w:rPr>
-      </w:pPr>
-      <w:r>
-        <w:rPr>
-          <w:color w:val="auto"/>
-          <w:sz w:val="22"/>
-          <w:szCs w:val="22"/>
-          <w:lang w:val="en-US"/>
-        </w:rPr>
-        <w:t>Because IPUMS provides a harmonized municipality code across census years, the 1970, 1980, and 2010 censuses can be linked directly using this identifier.</w:t>
+        <w:jc w:val="both"/>
+        <w:rPr>
+          <w:color w:val="auto"/>
+          <w:sz w:val="22"/>
+          <w:szCs w:val="22"/>
+          <w:lang w:val="en-US"/>
+        </w:rPr>
+      </w:pPr>
+      <w:r>
+        <w:rPr>
+          <w:color w:val="auto"/>
+          <w:sz w:val="22"/>
+          <w:szCs w:val="22"/>
+          <w:lang w:val="en-US"/>
+        </w:rPr>
+        <w:t>This procedure allowed us to match all LAPOP locations to an IPUMS municipality, yielding 56 distinct municipality matches. Many Argentine municipalities are not represented in LAPOP because the survey is not designed to be representative at the municipality level.</w:t>
       </w:r>
     </w:p>
     <w:p>
@@ -1050,7 +1615,7 @@
           <w:color w:val="2E75B6"/>
           <w:lang w:val="en-US"/>
         </w:rPr>
-        <w:t>4.2 Census to Electoral data — via municipal polygons</w:t>
+        <w:t>4.4 Final panel structure</w:t>
       </w:r>
     </w:p>
     <w:p>
@@ -1063,86 +1628,17 @@
       </w:pPr>
       <w:r>
         <w:rPr>
-          <w:lang w:val="en-US"/>
-        </w:rPr>
-        <w:t>Argentine electoral sections do not always match census municipalities one-to-one. We link the two using the harmonized 1970-2010 shapefile (</w:t>
-      </w:r>
-      <w:r>
-        <w:rPr>
-          <w:i/>
-          <w:iCs/>
-          <w:lang w:val="en-US"/>
-        </w:rPr>
-        <w:t>Data Raw/geo2_ar1970_2010/geo2_ar1970_2010.shp</w:t>
-      </w:r>
-      <w:r>
-        <w:rPr>
-          <w:lang w:val="en-US"/>
-        </w:rPr>
-        <w:t xml:space="preserve">). </w:t>
-      </w:r>
-      <w:commentRangeStart w:id="0"/>
-      <w:r>
-        <w:rPr>
-          <w:lang w:val="en-US"/>
-        </w:rPr>
-        <w:t xml:space="preserve">Each electoral section polygon is spatially matched to the census municipality polygon that shares its </w:t>
-      </w:r>
-      <w:r>
-        <w:rPr>
-          <w:i/>
-          <w:iCs/>
-          <w:lang w:val="en-US"/>
-        </w:rPr>
-        <w:t>mun_code</w:t>
-      </w:r>
-      <w:r>
-        <w:rPr>
-          <w:lang w:val="en-US"/>
-        </w:rPr>
-        <w:t xml:space="preserve">. Sections corresponding to the Falkland/South Georgia islands and to the Entre Rios unknown district are dropped. The province-and-section identifiers in the electoral data are then aligned to the harmonized </w:t>
-      </w:r>
-      <w:r>
-        <w:rPr>
-          <w:i/>
-          <w:iCs/>
-          <w:lang w:val="en-US"/>
-        </w:rPr>
-        <w:t>mun_code</w:t>
-      </w:r>
-      <w:r>
-        <w:rPr>
-          <w:lang w:val="en-US"/>
-        </w:rPr>
-        <w:t>.</w:t>
-      </w:r>
-      <w:commentRangeEnd w:id="0"/>
-      <w:r>
-        <w:rPr>
-          <w:rStyle w:val="Refdecomentario"/>
-          <w:sz w:val="22"/>
-          <w:szCs w:val="22"/>
-          <w:lang w:val="en-US"/>
-        </w:rPr>
-        <w:commentReference w:id="0"/>
-      </w:r>
-    </w:p>
-    <w:p>
-      <w:pPr>
-        <w:pStyle w:val="Ttulo2"/>
-        <w:spacing w:before="200" w:after="80" w:line="276" w:lineRule="auto"/>
-        <w:rPr>
-          <w:lang w:val="en-US"/>
-        </w:rPr>
-      </w:pPr>
-      <w:r>
-        <w:rPr>
-          <w:b/>
-          <w:bCs/>
-          <w:color w:val="2E75B6"/>
-          <w:lang w:val="en-US"/>
-        </w:rPr>
-        <w:t>4.3 Census to LAPOP — name matching plus manual review</w:t>
+          <w:b/>
+          <w:bCs/>
+          <w:lang w:val="en-US"/>
+        </w:rPr>
+        <w:t>Electoral analysis:</w:t>
+      </w:r>
+      <w:r>
+        <w:rPr>
+          <w:lang w:val="en-US"/>
+        </w:rPr>
+        <w:t xml:space="preserve"> Municipality × election year × election type (general or PASO), covering the 2011–2025 period. Elections are held every two years. The sample includes 312 municipalities.</w:t>
       </w:r>
     </w:p>
     <w:p>
@@ -1155,23 +1651,17 @@
       </w:pPr>
       <w:r>
         <w:rPr>
-          <w:lang w:val="en-US"/>
-        </w:rPr>
-        <w:t xml:space="preserve">LAPOP identifies respondents' location by province name and municipality name (text fields), not by a stable numeric code. In </w:t>
-      </w:r>
-      <w:r>
-        <w:rPr>
-          <w:i/>
-          <w:iCs/>
-          <w:lang w:val="en-US"/>
-        </w:rPr>
-        <w:t>06_Merge_LAPOP.R</w:t>
-      </w:r>
-      <w:r>
-        <w:rPr>
-          <w:lang w:val="en-US"/>
-        </w:rPr>
-        <w:t>:</w:t>
+          <w:b/>
+          <w:bCs/>
+          <w:lang w:val="en-US"/>
+        </w:rPr>
+        <w:t>Migration analysis:</w:t>
+      </w:r>
+      <w:r>
+        <w:rPr>
+          <w:lang w:val="en-US"/>
+        </w:rPr>
+        <w:t xml:space="preserve"> Individual × LAPOP survey round (2012, 2014, 2017, 2019, and 2023). The sample covers 56 municipalities.</w:t>
       </w:r>
     </w:p>
     <w:p>
@@ -1188,368 +1678,13 @@
           <w:bCs/>
           <w:lang w:val="en-US"/>
         </w:rPr>
-        <w:t>1. Normalize</w:t>
-      </w:r>
-      <w:r>
-        <w:rPr>
-          <w:lang w:val="en-US"/>
-        </w:rPr>
-        <w:t xml:space="preserve"> the LAPOP province and municipality strings (unaccent, uppercase, trim whitespace) and correct the handling of CABA / AMBA / Buenos Aires, so that CABA and its comunas are recoded to "CITY OF BUENOS AIRES", and AMBA is recoded to "BUENOS AIRES".</w:t>
-      </w:r>
-    </w:p>
-    <w:p>
-      <w:pPr>
-        <w:spacing w:before="60" w:after="60" w:line="276" w:lineRule="auto"/>
-        <w:jc w:val="both"/>
-        <w:rPr>
-          <w:lang w:val="en-US"/>
-        </w:rPr>
-      </w:pPr>
-      <w:r>
-        <w:rPr>
-          <w:b/>
-          <w:bCs/>
-          <w:lang w:val="en-US"/>
-        </w:rPr>
-        <w:t>2. Build a crosswalk</w:t>
-      </w:r>
-      <w:r>
-        <w:rPr>
-          <w:lang w:val="en-US"/>
-        </w:rPr>
-        <w:t xml:space="preserve"> of all (province, municipality) pairs in LAPOP and the harmonized census, matching by exact string equality on the cleaned names.</w:t>
-      </w:r>
-    </w:p>
-    <w:p>
-      <w:pPr>
-        <w:spacing w:before="60" w:after="60" w:line="276" w:lineRule="auto"/>
-        <w:jc w:val="both"/>
-      </w:pPr>
-      <w:r>
-        <w:rPr>
-          <w:b/>
-          <w:bCs/>
-          <w:lang w:val="en-US"/>
-        </w:rPr>
-        <w:t>3. Manually resolve the unmatched pairs.</w:t>
-      </w:r>
-      <w:r>
-        <w:rPr>
-          <w:lang w:val="en-US"/>
-        </w:rPr>
-        <w:t xml:space="preserve"> Approximately 58 LAPOP localities do not match directly; they are typically localidades inside a larger partido or departamento. We identify the correct census municipality (partido, departamento, or CAPITAL) each locality belongs to, and record the correction in a hard-coded </w:t>
-      </w:r>
-      <w:r>
-        <w:rPr>
-          <w:i/>
-          <w:iCs/>
-          <w:lang w:val="en-US"/>
-        </w:rPr>
-        <w:t>case_when</w:t>
-      </w:r>
-      <w:r>
-        <w:rPr>
-          <w:lang w:val="en-US"/>
-        </w:rPr>
-        <w:t xml:space="preserve"> block. Most manual corrections map localities to their partido (Greater Buenos Aires), or recode provincial capitals as CAPITAL to match the census naming </w:t>
-      </w:r>
-      <w:r>
-        <w:rPr>
-          <w:lang w:val="en-US"/>
-        </w:rPr>
-        <w:lastRenderedPageBreak/>
-        <w:t xml:space="preserve">convention. </w:t>
-      </w:r>
-      <w:r>
-        <w:t>Examples: SARANDI → AVELLANEDA (Buenos Aires); MAR DEL PLATA → GENERAL PUEYRREDON; SANTA ROSA → CAPITAL (La Pampa); VILLA CARLOS PAZ → PUNILLA (Cordoba).</w:t>
-      </w:r>
-    </w:p>
-    <w:p>
-      <w:pPr>
-        <w:pStyle w:val="Ttulo2"/>
-        <w:spacing w:before="200" w:after="80" w:line="276" w:lineRule="auto"/>
-        <w:rPr>
-          <w:lang w:val="en-US"/>
-        </w:rPr>
-      </w:pPr>
-      <w:r>
-        <w:rPr>
-          <w:b/>
-          <w:bCs/>
-          <w:color w:val="2E75B6"/>
-          <w:lang w:val="en-US"/>
-        </w:rPr>
-        <w:t>4.4 Final panel structure</w:t>
-      </w:r>
-    </w:p>
-    <w:p>
-      <w:pPr>
-        <w:spacing w:before="60" w:after="60" w:line="276" w:lineRule="auto"/>
-        <w:jc w:val="both"/>
-        <w:rPr>
-          <w:lang w:val="en-US"/>
-        </w:rPr>
-      </w:pPr>
-      <w:r>
-        <w:rPr>
-          <w:b/>
-          <w:bCs/>
-          <w:lang w:val="en-US"/>
-        </w:rPr>
-        <w:t>Electoral analysis:</w:t>
-      </w:r>
-      <w:r>
-        <w:rPr>
-          <w:lang w:val="en-US"/>
-        </w:rPr>
-        <w:t xml:space="preserve"> municipality x election year x election type (General or PASO), covering the 2011-2025 window.</w:t>
-      </w:r>
-    </w:p>
-    <w:p>
-      <w:pPr>
-        <w:spacing w:before="60" w:after="60" w:line="276" w:lineRule="auto"/>
-        <w:jc w:val="both"/>
-        <w:rPr>
-          <w:lang w:val="en-US"/>
-        </w:rPr>
-      </w:pPr>
-      <w:r>
-        <w:rPr>
-          <w:b/>
-          <w:bCs/>
-          <w:lang w:val="en-US"/>
-        </w:rPr>
-        <w:t>Migration analysis:</w:t>
-      </w:r>
-      <w:r>
-        <w:rPr>
-          <w:lang w:val="en-US"/>
-        </w:rPr>
-        <w:t xml:space="preserve"> individual x LAPOP round (2012, 2014, 2017, 2019, 2023), with municipal-level Spanish exposure attached by </w:t>
-      </w:r>
-      <w:r>
-        <w:rPr>
-          <w:i/>
-          <w:iCs/>
-          <w:lang w:val="en-US"/>
-        </w:rPr>
-        <w:t>mun_code</w:t>
-      </w:r>
-      <w:r>
-        <w:rPr>
-          <w:lang w:val="en-US"/>
-        </w:rPr>
-        <w:t>.</w:t>
-      </w:r>
-    </w:p>
-    <w:p>
-      <w:pPr>
-        <w:spacing w:before="60" w:after="60" w:line="276" w:lineRule="auto"/>
-        <w:jc w:val="both"/>
-        <w:rPr>
-          <w:lang w:val="en-US"/>
-        </w:rPr>
-      </w:pPr>
-      <w:r>
-        <w:rPr>
-          <w:b/>
-          <w:bCs/>
-          <w:lang w:val="en-US"/>
-        </w:rPr>
-        <w:t>Post-reform indicator:</w:t>
-      </w:r>
-      <w:r>
-        <w:rPr>
-          <w:lang w:val="en-US"/>
-        </w:rPr>
-        <w:t xml:space="preserve"> set to 1 for elections and survey rounds after December 2022 (Ley de Nietos reform). Election-year cutoff defined by </w:t>
-      </w:r>
-      <w:r>
-        <w:rPr>
-          <w:i/>
-          <w:iCs/>
-          <w:lang w:val="en-US"/>
-        </w:rPr>
-        <w:t>post_cutoff = 2022</w:t>
-      </w:r>
-      <w:r>
-        <w:rPr>
-          <w:lang w:val="en-US"/>
-        </w:rPr>
-        <w:t xml:space="preserve"> in the estimation scripts (adjustable to 2023 if a stricter definition is preferred).</w:t>
-      </w:r>
-    </w:p>
-    <w:p>
-      <w:pPr>
-        <w:pStyle w:val="Ttulo2"/>
-        <w:spacing w:before="200" w:after="80" w:line="276" w:lineRule="auto"/>
-        <w:rPr>
-          <w:lang w:val="en-US"/>
-        </w:rPr>
-      </w:pPr>
-      <w:r>
-        <w:rPr>
-          <w:b/>
-          <w:bCs/>
-          <w:color w:val="2E75B6"/>
-          <w:lang w:val="en-US"/>
-        </w:rPr>
-        <w:t>2.4 Exclusions</w:t>
-      </w:r>
-    </w:p>
-    <w:p>
-      <w:pPr>
-        <w:spacing w:before="60" w:after="60" w:line="276" w:lineRule="auto"/>
-        <w:jc w:val="both"/>
-        <w:rPr>
-          <w:lang w:val="en-US"/>
-        </w:rPr>
-      </w:pPr>
-      <w:commentRangeStart w:id="1"/>
-      <w:r>
-        <w:rPr>
-          <w:lang w:val="en-US"/>
-        </w:rPr>
-        <w:t xml:space="preserve">We drop </w:t>
-      </w:r>
-      <w:r>
-        <w:rPr>
-          <w:i/>
-          <w:iCs/>
-          <w:lang w:val="en-US"/>
-        </w:rPr>
-        <w:t>mun_code</w:t>
-      </w:r>
-      <w:r>
-        <w:rPr>
-          <w:lang w:val="en-US"/>
-        </w:rPr>
-        <w:t xml:space="preserve"> 094003 (South Georgia and South Sandwich Islands), 094004 (Falkland Islands) and 030000 (Entre Rios district unknown). Observations with </w:t>
-      </w:r>
-      <w:r>
-        <w:rPr>
-          <w:i/>
-          <w:iCs/>
-          <w:lang w:val="en-US"/>
-        </w:rPr>
-        <w:t>yrimm</w:t>
-      </w:r>
-      <w:r>
-        <w:rPr>
-          <w:lang w:val="en-US"/>
-        </w:rPr>
-        <w:t xml:space="preserve"> coded 0 (not in universe), 9998 (in transit) or 9999 (unknown) are also excluded.</w:t>
-      </w:r>
-      <w:commentRangeEnd w:id="1"/>
-      <w:r>
-        <w:rPr>
-          <w:rStyle w:val="Refdecomentario"/>
-          <w:sz w:val="22"/>
-          <w:szCs w:val="22"/>
-          <w:lang w:val="en-US"/>
-        </w:rPr>
-        <w:commentReference w:id="1"/>
-      </w:r>
-    </w:p>
-    <w:p>
-      <w:pPr>
-        <w:spacing w:line="276" w:lineRule="auto"/>
-        <w:rPr>
-          <w:lang w:val="en-US"/>
-        </w:rPr>
-      </w:pPr>
-    </w:p>
-    <w:p>
-      <w:pPr>
-        <w:spacing w:before="60" w:after="60" w:line="276" w:lineRule="auto"/>
-        <w:jc w:val="both"/>
-        <w:rPr>
-          <w:lang w:val="en-US"/>
-        </w:rPr>
-      </w:pPr>
-      <w:r>
-        <w:rPr>
-          <w:b/>
-          <w:bCs/>
-          <w:lang w:val="en-US"/>
-        </w:rPr>
-        <w:t>Note.</w:t>
-      </w:r>
-      <w:r>
-        <w:rPr>
-          <w:lang w:val="en-US"/>
-        </w:rPr>
-        <w:t xml:space="preserve"> Any change in the underlying data sources or in the tercile-splitting variables should be reflected consistently in </w:t>
-      </w:r>
-      <w:r>
-        <w:rPr>
-          <w:i/>
-          <w:iCs/>
-          <w:lang w:val="en-US"/>
-        </w:rPr>
-        <w:t>01_Data_Arg.R</w:t>
-      </w:r>
-      <w:r>
-        <w:rPr>
-          <w:lang w:val="en-US"/>
-        </w:rPr>
-        <w:t xml:space="preserve">, </w:t>
-      </w:r>
-      <w:r>
-        <w:rPr>
-          <w:i/>
-          <w:iCs/>
-          <w:lang w:val="en-US"/>
-        </w:rPr>
-        <w:t>02_Data_API_Arg.R</w:t>
-      </w:r>
-      <w:r>
-        <w:rPr>
-          <w:lang w:val="en-US"/>
-        </w:rPr>
-        <w:t xml:space="preserve">, </w:t>
-      </w:r>
-      <w:r>
-        <w:rPr>
-          <w:i/>
-          <w:iCs/>
-          <w:lang w:val="en-US"/>
-        </w:rPr>
-        <w:t>06_Data_LAPOP.do</w:t>
-      </w:r>
-      <w:r>
-        <w:rPr>
-          <w:lang w:val="en-US"/>
-        </w:rPr>
-        <w:t xml:space="preserve">, </w:t>
-      </w:r>
-      <w:r>
-        <w:rPr>
-          <w:i/>
-          <w:iCs/>
-          <w:lang w:val="en-US"/>
-        </w:rPr>
-        <w:t>06_Merge_LAPOP.R</w:t>
-      </w:r>
-      <w:r>
-        <w:rPr>
-          <w:lang w:val="en-US"/>
-        </w:rPr>
-        <w:t xml:space="preserve"> and </w:t>
-      </w:r>
-      <w:r>
-        <w:rPr>
-          <w:i/>
-          <w:iCs/>
-          <w:lang w:val="en-US"/>
-        </w:rPr>
-        <w:t>07_pre-processed_data.do</w:t>
-      </w:r>
-      <w:r>
-        <w:rPr>
-          <w:lang w:val="en-US"/>
-        </w:rPr>
-        <w:t>.</w:t>
+        <w:t xml:space="preserve">Post-reform indicator: </w:t>
+      </w:r>
+      <w:r>
+        <w:rPr>
+          <w:lang w:val="en-US"/>
+        </w:rPr>
+        <w:t>Equal to 1 for elections and survey rounds occurring after the 2022 reform, and 0 otherwise.</w:t>
       </w:r>
     </w:p>
     <w:sectPr>
@@ -1562,66 +1697,6 @@
 </w:document>
 </file>
 
-<file path=word/comments.xml><?xml version="1.0" encoding="utf-8"?>
-<w:comments xmlns:wpc="http://schemas.microsoft.com/office/word/2010/wordprocessingCanvas" xmlns:cx="http://schemas.microsoft.com/office/drawing/2014/chartex" xmlns:cx1="http://schemas.microsoft.com/office/drawing/2015/9/8/chartex" xmlns:cx2="http://schemas.microsoft.com/office/drawing/2015/10/21/chartex" xmlns:cx3="http://schemas.microsoft.com/office/drawing/2016/5/9/chartex" xmlns:cx4="http://schemas.microsoft.com/office/drawing/2016/5/10/chartex" xmlns:cx5="http://schemas.microsoft.com/office/drawing/2016/5/11/chartex" xmlns:cx6="http://schemas.microsoft.com/office/drawing/2016/5/12/chartex" xmlns:cx7="http://schemas.microsoft.com/office/drawing/2016/5/13/chartex" xmlns:cx8="http://schemas.microsoft.com/office/drawing/2016/5/14/chartex" xmlns:mc="http://schemas.openxmlformats.org/markup-compatibility/2006" xmlns:m="http://schemas.openxmlformats.org/officeDocument/2006/math" xmlns:aink="http://schemas.microsoft.com/office/drawing/2016/ink" xmlns:am3d="http://schemas.microsoft.com/office/drawing/2017/model3d" xmlns:oel="http://schemas.microsoft.com/office/2019/extlst" xmlns:r="http://schemas.openxmlformats.org/officeDocument/2006/relationships" xmlns:wp14="http://schemas.microsoft.com/office/word/2010/wordprocessingDrawing" xmlns:wp="http://schemas.openxmlformats.org/drawingml/2006/wordprocessingDrawing" xmlns:wpg="http://schemas.microsoft.com/office/word/2010/wordprocessingGroup" xmlns:wpi="http://schemas.microsoft.com/office/word/2010/wordprocessingInk" xmlns:wps="http://schemas.microsoft.com/office/word/2010/wordprocessingShape" xmlns:o="urn:schemas-microsoft-com:office:office" xmlns:v="urn:schemas-microsoft-com:vml" xmlns:w10="urn:schemas-microsoft-com:office:word" xmlns:w="http://schemas.openxmlformats.org/wordprocessingml/2006/main" xmlns:w14="http://schemas.microsoft.com/office/word/2010/wordml" xmlns:w15="http://schemas.microsoft.com/office/word/2012/wordml" xmlns:w16cex="http://schemas.microsoft.com/office/word/2018/wordml/cex" xmlns:w16cid="http://schemas.microsoft.com/office/word/2016/wordml/cid" xmlns:w16="http://schemas.microsoft.com/office/word/2018/wordml" xmlns:w16sdtdh="http://schemas.microsoft.com/office/word/2020/wordml/sdtdatahash" xmlns:w16sdtfl="http://schemas.microsoft.com/office/word/2024/wordml/sdtformatlock" xmlns:w16se="http://schemas.microsoft.com/office/word/2015/wordml/symex" xmlns:w16du="http://schemas.microsoft.com/office/word/2023/wordml/word16du" xmlns:wne="http://schemas.microsoft.com/office/word/2006/wordml" mc:Ignorable="w14 w15 w16se w16cid w16 w16cex w16sdtdh w16sdtfl w16du wp14">
-  <w:comment w:id="0" w:author="Florencia ruiz" w:date="2026-07-12T20:42:00Z" w:initials="Fr">
-    <w:p>
-      <w:r>
-        <w:rPr>
-          <w:rStyle w:val="Refdecomentario"/>
-        </w:rPr>
-        <w:annotationRef/>
-      </w:r>
-      <w:r>
-        <w:rPr>
-          <w:sz w:val="20"/>
-          <w:szCs w:val="20"/>
-        </w:rPr>
-        <w:t>mejorar</w:t>
-      </w:r>
-    </w:p>
-  </w:comment>
-  <w:comment w:id="1" w:author="Florencia ruiz" w:date="2026-07-12T20:34:00Z" w:initials="Fr">
-    <w:p>
-      <w:r>
-        <w:rPr>
-          <w:rStyle w:val="Refdecomentario"/>
-        </w:rPr>
-        <w:annotationRef/>
-      </w:r>
-      <w:r>
-        <w:rPr>
-          <w:sz w:val="20"/>
-          <w:szCs w:val="20"/>
-        </w:rPr>
-        <w:t>agregar que quedan 312 municipalidades despues de esto? pasar a la parte del merge</w:t>
-      </w:r>
-    </w:p>
-  </w:comment>
-</w:comments>
-</file>
-
-<file path=word/commentsExtended.xml><?xml version="1.0" encoding="utf-8"?>
-<w15:commentsEx xmlns:wpc="http://schemas.microsoft.com/office/word/2010/wordprocessingCanvas" xmlns:cx="http://schemas.microsoft.com/office/drawing/2014/chartex" xmlns:cx1="http://schemas.microsoft.com/office/drawing/2015/9/8/chartex" xmlns:cx2="http://schemas.microsoft.com/office/drawing/2015/10/21/chartex" xmlns:cx3="http://schemas.microsoft.com/office/drawing/2016/5/9/chartex" xmlns:cx4="http://schemas.microsoft.com/office/drawing/2016/5/10/chartex" xmlns:cx5="http://schemas.microsoft.com/office/drawing/2016/5/11/chartex" xmlns:cx6="http://schemas.microsoft.com/office/drawing/2016/5/12/chartex" xmlns:cx7="http://schemas.microsoft.com/office/drawing/2016/5/13/chartex" xmlns:cx8="http://schemas.microsoft.com/office/drawing/2016/5/14/chartex" xmlns:mc="http://schemas.openxmlformats.org/markup-compatibility/2006" xmlns:m="http://schemas.openxmlformats.org/officeDocument/2006/math" xmlns:aink="http://schemas.microsoft.com/office/drawing/2016/ink" xmlns:am3d="http://schemas.microsoft.com/office/drawing/2017/model3d" xmlns:oel="http://schemas.microsoft.com/office/2019/extlst" xmlns:r="http://schemas.openxmlformats.org/officeDocument/2006/relationships" xmlns:wp14="http://schemas.microsoft.com/office/word/2010/wordprocessingDrawing" xmlns:wp="http://schemas.openxmlformats.org/drawingml/2006/wordprocessingDrawing" xmlns:wpg="http://schemas.microsoft.com/office/word/2010/wordprocessingGroup" xmlns:wpi="http://schemas.microsoft.com/office/word/2010/wordprocessingInk" xmlns:wps="http://schemas.microsoft.com/office/word/2010/wordprocessingShape" xmlns:o="urn:schemas-microsoft-com:office:office" xmlns:v="urn:schemas-microsoft-com:vml" xmlns:w10="urn:schemas-microsoft-com:office:word" xmlns:w="http://schemas.openxmlformats.org/wordprocessingml/2006/main" xmlns:w14="http://schemas.microsoft.com/office/word/2010/wordml" xmlns:w15="http://schemas.microsoft.com/office/word/2012/wordml" xmlns:w16cex="http://schemas.microsoft.com/office/word/2018/wordml/cex" xmlns:w16cid="http://schemas.microsoft.com/office/word/2016/wordml/cid" xmlns:w16="http://schemas.microsoft.com/office/word/2018/wordml" xmlns:w16sdtdh="http://schemas.microsoft.com/office/word/2020/wordml/sdtdatahash" xmlns:w16sdtfl="http://schemas.microsoft.com/office/word/2024/wordml/sdtformatlock" xmlns:w16se="http://schemas.microsoft.com/office/word/2015/wordml/symex" xmlns:w16du="http://schemas.microsoft.com/office/word/2023/wordml/word16du" xmlns:wne="http://schemas.microsoft.com/office/word/2006/wordml" mc:Ignorable="w14 w15 w16se w16cid w16 w16cex w16sdtdh w16sdtfl w16du wp14">
-  <w15:commentEx w15:paraId="78289C85" w15:done="0"/>
-  <w15:commentEx w15:paraId="432CE5E1" w15:done="0"/>
-</w15:commentsEx>
-</file>
-
-<file path=word/commentsExtensible.xml><?xml version="1.0" encoding="utf-8"?>
-<w16cex:commentsExtensible xmlns:wpc="http://schemas.microsoft.com/office/word/2010/wordprocessingCanvas" xmlns:cx="http://schemas.microsoft.com/office/drawing/2014/chartex" xmlns:cx1="http://schemas.microsoft.com/office/drawing/2015/9/8/chartex" xmlns:cx2="http://schemas.microsoft.com/office/drawing/2015/10/21/chartex" xmlns:cx3="http://schemas.microsoft.com/office/drawing/2016/5/9/chartex" xmlns:cx4="http://schemas.microsoft.com/office/drawing/2016/5/10/chartex" xmlns:cx5="http://schemas.microsoft.com/office/drawing/2016/5/11/chartex" xmlns:cx6="http://schemas.microsoft.com/office/drawing/2016/5/12/chartex" xmlns:cx7="http://schemas.microsoft.com/office/drawing/2016/5/13/chartex" xmlns:cx8="http://schemas.microsoft.com/office/drawing/2016/5/14/chartex" xmlns:cr="http://schemas.microsoft.com/office/comments/2020/reactions" xmlns:mc="http://schemas.openxmlformats.org/markup-compatibility/2006" xmlns:m="http://schemas.openxmlformats.org/officeDocument/2006/math" xmlns:aink="http://schemas.microsoft.com/office/drawing/2016/ink" xmlns:am3d="http://schemas.microsoft.com/office/drawing/2017/model3d" xmlns:oel="http://schemas.microsoft.com/office/2019/extlst" xmlns:r="http://schemas.openxmlformats.org/officeDocument/2006/relationships" xmlns:wp14="http://schemas.microsoft.com/office/word/2010/wordprocessingDrawing" xmlns:wp="http://schemas.openxmlformats.org/drawingml/2006/wordprocessingDrawing" xmlns:wpg="http://schemas.microsoft.com/office/word/2010/wordprocessingGroup" xmlns:wpi="http://schemas.microsoft.com/office/word/2010/wordprocessingInk" xmlns:wps="http://schemas.microsoft.com/office/word/2010/wordprocessingShape" xmlns:o="urn:schemas-microsoft-com:office:office" xmlns:v="urn:schemas-microsoft-com:vml" xmlns:w10="urn:schemas-microsoft-com:office:word" xmlns:w="http://schemas.openxmlformats.org/wordprocessingml/2006/main" xmlns:w14="http://schemas.microsoft.com/office/word/2010/wordml" xmlns:w15="http://schemas.microsoft.com/office/word/2012/wordml" xmlns:w16cex="http://schemas.microsoft.com/office/word/2018/wordml/cex" xmlns:w16cid="http://schemas.microsoft.com/office/word/2016/wordml/cid" xmlns:w16="http://schemas.microsoft.com/office/word/2018/wordml" xmlns:w16sdtdh="http://schemas.microsoft.com/office/word/2020/wordml/sdtdatahash" xmlns:w16sdtfl="http://schemas.microsoft.com/office/word/2024/wordml/sdtformatlock" xmlns:w16se="http://schemas.microsoft.com/office/word/2015/wordml/symex" xmlns:w16du="http://schemas.microsoft.com/office/word/2023/wordml/word16du" xmlns:wne="http://schemas.microsoft.com/office/word/2006/wordml" mc:Ignorable="w14 w15 w16se w16cid w16 w16cex w16sdtdh w16sdtfl cr w16du wp14">
-  <w16cex:commentExtensible w16cex:durableId="4B9DF9A3" w16cex:dateUtc="2026-07-12T23:42:00Z"/>
-  <w16cex:commentExtensible w16cex:durableId="4D49E3BE" w16cex:dateUtc="2026-07-12T23:34:00Z"/>
-</w16cex:commentsExtensible>
-</file>
-
-<file path=word/commentsIds.xml><?xml version="1.0" encoding="utf-8"?>
-<w16cid:commentsIds xmlns:wpc="http://schemas.microsoft.com/office/word/2010/wordprocessingCanvas" xmlns:cx="http://schemas.microsoft.com/office/drawing/2014/chartex" xmlns:cx1="http://schemas.microsoft.com/office/drawing/2015/9/8/chartex" xmlns:cx2="http://schemas.microsoft.com/office/drawing/2015/10/21/chartex" xmlns:cx3="http://schemas.microsoft.com/office/drawing/2016/5/9/chartex" xmlns:cx4="http://schemas.microsoft.com/office/drawing/2016/5/10/chartex" xmlns:cx5="http://schemas.microsoft.com/office/drawing/2016/5/11/chartex" xmlns:cx6="http://schemas.microsoft.com/office/drawing/2016/5/12/chartex" xmlns:cx7="http://schemas.microsoft.com/office/drawing/2016/5/13/chartex" xmlns:cx8="http://schemas.microsoft.com/office/drawing/2016/5/14/chartex" xmlns:mc="http://schemas.openxmlformats.org/markup-compatibility/2006" xmlns:m="http://schemas.openxmlformats.org/officeDocument/2006/math" xmlns:aink="http://schemas.microsoft.com/office/drawing/2016/ink" xmlns:am3d="http://schemas.microsoft.com/office/drawing/2017/model3d" xmlns:oel="http://schemas.microsoft.com/office/2019/extlst" xmlns:r="http://schemas.openxmlformats.org/officeDocument/2006/relationships" xmlns:wp14="http://schemas.microsoft.com/office/word/2010/wordprocessingDrawing" xmlns:wp="http://schemas.openxmlformats.org/drawingml/2006/wordprocessingDrawing" xmlns:wpg="http://schemas.microsoft.com/office/word/2010/wordprocessingGroup" xmlns:wpi="http://schemas.microsoft.com/office/word/2010/wordprocessingInk" xmlns:wps="http://schemas.microsoft.com/office/word/2010/wordprocessingShape" xmlns:o="urn:schemas-microsoft-com:office:office" xmlns:v="urn:schemas-microsoft-com:vml" xmlns:w10="urn:schemas-microsoft-com:office:word" xmlns:w="http://schemas.openxmlformats.org/wordprocessingml/2006/main" xmlns:w14="http://schemas.microsoft.com/office/word/2010/wordml" xmlns:w15="http://schemas.microsoft.com/office/word/2012/wordml" xmlns:w16cex="http://schemas.microsoft.com/office/word/2018/wordml/cex" xmlns:w16cid="http://schemas.microsoft.com/office/word/2016/wordml/cid" xmlns:w16="http://schemas.microsoft.com/office/word/2018/wordml" xmlns:w16sdtdh="http://schemas.microsoft.com/office/word/2020/wordml/sdtdatahash" xmlns:w16sdtfl="http://schemas.microsoft.com/office/word/2024/wordml/sdtformatlock" xmlns:w16se="http://schemas.microsoft.com/office/word/2015/wordml/symex" xmlns:w16du="http://schemas.microsoft.com/office/word/2023/wordml/word16du" xmlns:wne="http://schemas.microsoft.com/office/word/2006/wordml" mc:Ignorable="w14 w15 w16se w16cid w16 w16cex w16sdtdh w16sdtfl w16du wp14">
-  <w16cid:commentId w16cid:paraId="78289C85" w16cid:durableId="4B9DF9A3"/>
-  <w16cid:commentId w16cid:paraId="432CE5E1" w16cid:durableId="4D49E3BE"/>
-</w16cid:commentsIds>
-</file>
-
 <file path=word/endnotes.xml><?xml version="1.0" encoding="utf-8"?>
 <w:endnotes xmlns:wpc="http://schemas.microsoft.com/office/word/2010/wordprocessingCanvas" xmlns:cx="http://schemas.microsoft.com/office/drawing/2014/chartex" xmlns:cx1="http://schemas.microsoft.com/office/drawing/2015/9/8/chartex" xmlns:cx2="http://schemas.microsoft.com/office/drawing/2015/10/21/chartex" xmlns:cx3="http://schemas.microsoft.com/office/drawing/2016/5/9/chartex" xmlns:cx4="http://schemas.microsoft.com/office/drawing/2016/5/10/chartex" xmlns:cx5="http://schemas.microsoft.com/office/drawing/2016/5/11/chartex" xmlns:cx6="http://schemas.microsoft.com/office/drawing/2016/5/12/chartex" xmlns:cx7="http://schemas.microsoft.com/office/drawing/2016/5/13/chartex" xmlns:cx8="http://schemas.microsoft.com/office/drawing/2016/5/14/chartex" xmlns:mc="http://schemas.openxmlformats.org/markup-compatibility/2006" xmlns:m="http://schemas.openxmlformats.org/officeDocument/2006/math" xmlns:aink="http://schemas.microsoft.com/office/drawing/2016/ink" xmlns:am3d="http://schemas.microsoft.com/office/drawing/2017/model3d" xmlns:oel="http://schemas.microsoft.com/office/2019/extlst" xmlns:r="http://schemas.openxmlformats.org/officeDocument/2006/relationships" xmlns:wp14="http://schemas.microsoft.com/office/word/2010/wordprocessingDrawing" xmlns:wp="http://schemas.openxmlformats.org/drawingml/2006/wordprocessingDrawing" xmlns:wpg="http://schemas.microsoft.com/office/word/2010/wordprocessingGroup" xmlns:wpi="http://schemas.microsoft.com/office/word/2010/wordprocessingInk" xmlns:wps="http://schemas.microsoft.com/office/word/2010/wordprocessingShape" xmlns:o="urn:schemas-microsoft-com:office:office" xmlns:v="urn:schemas-microsoft-com:vml" xmlns:w10="urn:schemas-microsoft-com:office:word" xmlns:w="http://schemas.openxmlformats.org/wordprocessingml/2006/main" xmlns:w14="http://schemas.microsoft.com/office/word/2010/wordml" xmlns:w15="http://schemas.microsoft.com/office/word/2012/wordml" xmlns:w16cex="http://schemas.microsoft.com/office/word/2018/wordml/cex" xmlns:w16cid="http://schemas.microsoft.com/office/word/2016/wordml/cid" xmlns:w16="http://schemas.microsoft.com/office/word/2018/wordml" xmlns:w16sdtdh="http://schemas.microsoft.com/office/word/2020/wordml/sdtdatahash" xmlns:w16sdtfl="http://schemas.microsoft.com/office/word/2024/wordml/sdtformatlock" xmlns:w16se="http://schemas.microsoft.com/office/word/2015/wordml/symex" xmlns:w16du="http://schemas.microsoft.com/office/word/2023/wordml/word16du" xmlns:wne="http://schemas.microsoft.com/office/word/2006/wordml" mc:Ignorable="w14 w15 w16se w16cid w16 w16cex w16sdtdh w16sdtfl w16du wp14">
   <w:endnote w:type="separator" w:id="-1">
@@ -1677,13 +1752,7 @@
         <w:rPr>
           <w:lang w:val="en-US"/>
         </w:rPr>
-        <w:t xml:space="preserve"> </w:t>
-      </w:r>
-      <w:r>
-        <w:rPr>
-          <w:lang w:val="en-US"/>
-        </w:rPr>
-        <w:t>The survey also includes a 2021 round</w:t>
+        <w:t xml:space="preserve"> The survey also includes a 2021 round</w:t>
       </w:r>
       <w:r>
         <w:rPr>
@@ -1797,14 +1866,6 @@
     </w:lvlOverride>
   </w:num>
 </w:numbering>
-</file>
-
-<file path=word/people.xml><?xml version="1.0" encoding="utf-8"?>
-<w15:people xmlns:wpc="http://schemas.microsoft.com/office/word/2010/wordprocessingCanvas" xmlns:cx="http://schemas.microsoft.com/office/drawing/2014/chartex" xmlns:cx1="http://schemas.microsoft.com/office/drawing/2015/9/8/chartex" xmlns:cx2="http://schemas.microsoft.com/office/drawing/2015/10/21/chartex" xmlns:cx3="http://schemas.microsoft.com/office/drawing/2016/5/9/chartex" xmlns:cx4="http://schemas.microsoft.com/office/drawing/2016/5/10/chartex" xmlns:cx5="http://schemas.microsoft.com/office/drawing/2016/5/11/chartex" xmlns:cx6="http://schemas.microsoft.com/office/drawing/2016/5/12/chartex" xmlns:cx7="http://schemas.microsoft.com/office/drawing/2016/5/13/chartex" xmlns:cx8="http://schemas.microsoft.com/office/drawing/2016/5/14/chartex" xmlns:mc="http://schemas.openxmlformats.org/markup-compatibility/2006" xmlns:m="http://schemas.openxmlformats.org/officeDocument/2006/math" xmlns:aink="http://schemas.microsoft.com/office/drawing/2016/ink" xmlns:am3d="http://schemas.microsoft.com/office/drawing/2017/model3d" xmlns:oel="http://schemas.microsoft.com/office/2019/extlst" xmlns:r="http://schemas.openxmlformats.org/officeDocument/2006/relationships" xmlns:wp14="http://schemas.microsoft.com/office/word/2010/wordprocessingDrawing" xmlns:wp="http://schemas.openxmlformats.org/drawingml/2006/wordprocessingDrawing" xmlns:wpg="http://schemas.microsoft.com/office/word/2010/wordprocessingGroup" xmlns:wpi="http://schemas.microsoft.com/office/word/2010/wordprocessingInk" xmlns:wps="http://schemas.microsoft.com/office/word/2010/wordprocessingShape" xmlns:o="urn:schemas-microsoft-com:office:office" xmlns:v="urn:schemas-microsoft-com:vml" xmlns:w10="urn:schemas-microsoft-com:office:word" xmlns:w="http://schemas.openxmlformats.org/wordprocessingml/2006/main" xmlns:w14="http://schemas.microsoft.com/office/word/2010/wordml" xmlns:w15="http://schemas.microsoft.com/office/word/2012/wordml" xmlns:w16cex="http://schemas.microsoft.com/office/word/2018/wordml/cex" xmlns:w16cid="http://schemas.microsoft.com/office/word/2016/wordml/cid" xmlns:w16="http://schemas.microsoft.com/office/word/2018/wordml" xmlns:w16sdtdh="http://schemas.microsoft.com/office/word/2020/wordml/sdtdatahash" xmlns:w16sdtfl="http://schemas.microsoft.com/office/word/2024/wordml/sdtformatlock" xmlns:w16se="http://schemas.microsoft.com/office/word/2015/wordml/symex" xmlns:w16du="http://schemas.microsoft.com/office/word/2023/wordml/word16du" xmlns:wne="http://schemas.microsoft.com/office/word/2006/wordml" mc:Ignorable="w14 w15 w16se w16cid w16 w16cex w16sdtdh w16sdtfl w16du wp14">
-  <w15:person w15:author="Florencia ruiz">
-    <w15:presenceInfo w15:providerId="Windows Live" w15:userId="7b066f386e5ac473"/>
-  </w15:person>
-</w15:people>
 </file>
 
 <file path=word/styles.xml><?xml version="1.0" encoding="utf-8"?>
@@ -2288,6 +2349,7 @@
   <w:style w:type="character" w:default="1" w:styleId="Fuentedeprrafopredeter">
     <w:name w:val="Default Paragraph Font"/>
     <w:uiPriority w:val="1"/>
+    <w:semiHidden/>
     <w:unhideWhenUsed/>
   </w:style>
   <w:style w:type="table" w:default="1" w:styleId="Tablanormal">
@@ -2478,6 +2540,19 @@
     <w:rPr>
       <w:color w:val="605E5C"/>
       <w:shd w:val="clear" w:color="auto" w:fill="E1DFDD"/>
+    </w:rPr>
+  </w:style>
+  <w:style w:type="paragraph" w:customStyle="1" w:styleId="p1">
+    <w:name w:val="p1"/>
+    <w:basedOn w:val="Normal"/>
+    <w:rsid w:val="00FB40D8"/>
+    <w:pPr>
+      <w:spacing w:before="100" w:beforeAutospacing="1" w:after="100" w:afterAutospacing="1"/>
+    </w:pPr>
+    <w:rPr>
+      <w:rFonts w:ascii="Times New Roman" w:eastAsia="Times New Roman" w:hAnsi="Times New Roman" w:cs="Times New Roman"/>
+      <w:sz w:val="24"/>
+      <w:szCs w:val="24"/>
     </w:rPr>
   </w:style>
 </w:styles>
@@ -2803,7 +2878,7 @@
 </file>
 
 <file path=customXml/itemProps1.xml><?xml version="1.0" encoding="utf-8"?>
-<ds:datastoreItem xmlns:ds="http://schemas.openxmlformats.org/officeDocument/2006/customXml" ds:itemID="{0EF075D0-A7BF-1746-A681-A2C2AFAD9C03}">
+<ds:datastoreItem xmlns:ds="http://schemas.openxmlformats.org/officeDocument/2006/customXml" ds:itemID="{81ED9E2C-27C2-F045-BBF0-DDB58D6578F7}">
   <ds:schemaRefs>
     <ds:schemaRef ds:uri="http://schemas.openxmlformats.org/officeDocument/2006/bibliography"/>
   </ds:schemaRefs>

</xml_diff>